<commit_message>
Cross-reference calculation procedure to CTP0007 cells
</commit_message>
<xml_diff>
--- a/docs/CTP0007_Issue_H_Calculation_Procedure.docx
+++ b/docs/CTP0007_Issue_H_Calculation_Procedure.docx
@@ -4,7 +4,7 @@
   <w:body>
     <w:p>
       <w:pPr>
-        <w:pStyle w:val="Heading1"/>
+        <w:pStyle w:val="Title"/>
       </w:pPr>
       <w:r>
         <w:t>CTP0007 Issue H Calculation Procedure</w:t>
@@ -17,7 +17,7 @@
     </w:p>
     <w:p>
       <w:pPr>
-        <w:pStyle w:val="Heading2"/>
+        <w:pStyle w:val="Heading1"/>
       </w:pPr>
       <w:r>
         <w:t>1. Input Selection</w:t>
@@ -39,25 +39,16 @@
       </w:r>
     </w:p>
     <w:p>
-      <w:pPr>
-        <w:pStyle w:val="ListNumber"/>
-      </w:pPr>
       <w:r>
         <w:t>User-entered tightening torque.</w:t>
       </w:r>
     </w:p>
     <w:p>
-      <w:pPr>
-        <w:pStyle w:val="ListNumber"/>
-      </w:pPr>
       <w:r>
         <w:t>User-entered percent of tensile yield strength, `% TYS`.</w:t>
       </w:r>
     </w:p>
     <w:p>
-      <w:pPr>
-        <w:pStyle w:val="ListNumber"/>
-      </w:pPr>
       <w:r>
         <w:t>Standard tightening torque from the selected screw type, size, and material.</w:t>
       </w:r>
@@ -69,7 +60,7 @@
     </w:p>
     <w:p>
       <w:pPr>
-        <w:pStyle w:val="Heading2"/>
+        <w:pStyle w:val="Heading1"/>
       </w:pPr>
       <w:r>
         <w:t>2. Geometry</w:t>
@@ -81,65 +72,41 @@
       </w:r>
     </w:p>
     <w:p>
-      <w:pPr>
-        <w:pStyle w:val="ListBullet"/>
-      </w:pPr>
       <w:r>
         <w:t>`d` = thread major diameter</w:t>
       </w:r>
     </w:p>
     <w:p>
-      <w:pPr>
-        <w:pStyle w:val="ListBullet"/>
-      </w:pPr>
       <w:r>
         <w:t>`p` = thread pitch</w:t>
       </w:r>
     </w:p>
     <w:p>
-      <w:pPr>
-        <w:pStyle w:val="ListBullet"/>
-      </w:pPr>
       <w:r>
         <w:t>`ds` = shank diameter</w:t>
       </w:r>
     </w:p>
     <w:p>
-      <w:pPr>
-        <w:pStyle w:val="ListBullet"/>
-      </w:pPr>
       <w:r>
         <w:t>`dg` = groove diameter</w:t>
       </w:r>
     </w:p>
     <w:p>
-      <w:pPr>
-        <w:pStyle w:val="ListBullet"/>
-      </w:pPr>
       <w:r>
         <w:t>`dc` = contact diameter</w:t>
       </w:r>
     </w:p>
     <w:p>
-      <w:pPr>
-        <w:pStyle w:val="ListBullet"/>
-      </w:pPr>
       <w:r>
         <w:t>`Sy` = bolt tensile yield strength</w:t>
       </w:r>
     </w:p>
     <w:p>
-      <w:pPr>
-        <w:pStyle w:val="ListBullet"/>
-      </w:pPr>
       <w:r>
         <w:t>`n` = screw count</w:t>
       </w:r>
     </w:p>
     <w:p>
-      <w:pPr>
-        <w:pStyle w:val="ListBullet"/>
-      </w:pPr>
       <w:r>
         <w:t>`PCD` = pitch circle diameter</w:t>
       </w:r>
@@ -150,16 +117,7 @@
       </w:r>
     </w:p>
     <w:p>
-      <w:pPr>
-        <w:pStyle w:val="FormulaBlock"/>
-        <w:spacing w:before="60" w:after="120"/>
-        <w:ind w:left="259"/>
-      </w:pPr>
       <w:r>
-        <w:rPr>
-          <w:rFonts w:ascii="Courier New" w:hAnsi="Courier New"/>
-          <w:sz w:val="17"/>
-        </w:rPr>
         <w:t>dp = d - 0.6495 * p</w:t>
       </w:r>
     </w:p>
@@ -169,16 +127,7 @@
       </w:r>
     </w:p>
     <w:p>
-      <w:pPr>
-        <w:pStyle w:val="FormulaBlock"/>
-        <w:spacing w:before="60" w:after="120"/>
-        <w:ind w:left="259"/>
-      </w:pPr>
       <w:r>
-        <w:rPr>
-          <w:rFonts w:ascii="Courier New" w:hAnsi="Courier New"/>
-          <w:sz w:val="17"/>
-        </w:rPr>
         <w:t>dr = d - 1.2268 * p</w:t>
       </w:r>
     </w:p>
@@ -188,16 +137,7 @@
       </w:r>
     </w:p>
     <w:p>
-      <w:pPr>
-        <w:pStyle w:val="FormulaBlock"/>
-        <w:spacing w:before="60" w:after="120"/>
-        <w:ind w:left="259"/>
-      </w:pPr>
       <w:r>
-        <w:rPr>
-          <w:rFonts w:ascii="Courier New" w:hAnsi="Courier New"/>
-          <w:sz w:val="17"/>
-        </w:rPr>
         <w:t>dt = (dp + dr) / 2</w:t>
       </w:r>
     </w:p>
@@ -207,16 +147,7 @@
       </w:r>
     </w:p>
     <w:p>
-      <w:pPr>
-        <w:pStyle w:val="FormulaBlock"/>
-        <w:spacing w:before="60" w:after="120"/>
-        <w:ind w:left="259"/>
-      </w:pPr>
       <w:r>
-        <w:rPr>
-          <w:rFonts w:ascii="Courier New" w:hAnsi="Courier New"/>
-          <w:sz w:val="17"/>
-        </w:rPr>
         <w:t>As = pi * ((dp + dr) / 4)^2</w:t>
       </w:r>
     </w:p>
@@ -226,16 +157,7 @@
       </w:r>
     </w:p>
     <w:p>
-      <w:pPr>
-        <w:pStyle w:val="FormulaBlock"/>
-        <w:spacing w:before="60" w:after="120"/>
-        <w:ind w:left="259"/>
-      </w:pPr>
       <w:r>
-        <w:rPr>
-          <w:rFonts w:ascii="Courier New" w:hAnsi="Courier New"/>
-          <w:sz w:val="17"/>
-        </w:rPr>
         <w:t>dsb = dt    when shear plane is Thread</w:t>
         <w:br/>
         <w:t>dsb = ds    when shear plane is Shank</w:t>
@@ -247,16 +169,7 @@
       </w:r>
     </w:p>
     <w:p>
-      <w:pPr>
-        <w:pStyle w:val="FormulaBlock"/>
-        <w:spacing w:before="60" w:after="120"/>
-        <w:ind w:left="259"/>
-      </w:pPr>
       <w:r>
-        <w:rPr>
-          <w:rFonts w:ascii="Courier New" w:hAnsi="Courier New"/>
-          <w:sz w:val="17"/>
-        </w:rPr>
         <w:t>dc = special contact diameter    for SPECIAL screws</w:t>
         <w:br/>
         <w:t>dc = special contact diameter    when Nut contact is Special and value &gt; 0</w:t>
@@ -270,16 +183,7 @@
       </w:r>
     </w:p>
     <w:p>
-      <w:pPr>
-        <w:pStyle w:val="FormulaBlock"/>
-        <w:spacing w:before="60" w:after="120"/>
-        <w:ind w:left="259"/>
-      </w:pPr>
       <w:r>
-        <w:rPr>
-          <w:rFonts w:ascii="Courier New" w:hAnsi="Courier New"/>
-          <w:sz w:val="17"/>
-        </w:rPr>
         <w:t>Ro = dc / 2</w:t>
         <w:br/>
         <w:t>Ri = dp / 2</w:t>
@@ -294,7 +198,7 @@
     </w:p>
     <w:p>
       <w:pPr>
-        <w:pStyle w:val="Heading2"/>
+        <w:pStyle w:val="Heading1"/>
       </w:pPr>
       <w:r>
         <w:t>3. Effective Lever Arm</w:t>
@@ -306,16 +210,7 @@
       </w:r>
     </w:p>
     <w:p>
-      <w:pPr>
-        <w:pStyle w:val="FormulaBlock"/>
-        <w:spacing w:before="60" w:after="120"/>
-        <w:ind w:left="259"/>
-      </w:pPr>
       <w:r>
-        <w:rPr>
-          <w:rFonts w:ascii="Courier New" w:hAnsi="Courier New"/>
-          <w:sz w:val="17"/>
-        </w:rPr>
         <w:t>Leff = 0.05 mm                         for Stripper bolt</w:t>
         <w:br/>
         <w:t>Leff = 0.15 * pack_thickness_mm        for Drive bolt</w:t>
@@ -330,7 +225,7 @@
     </w:p>
     <w:p>
       <w:pPr>
-        <w:pStyle w:val="Heading2"/>
+        <w:pStyle w:val="Heading1"/>
       </w:pPr>
       <w:r>
         <w:t>4. Tightening, Pretension, and Friction Torque</w:t>
@@ -342,41 +237,26 @@
       </w:r>
     </w:p>
     <w:p>
-      <w:pPr>
-        <w:pStyle w:val="ListBullet"/>
-      </w:pPr>
       <w:r>
         <w:t>`mu_sn` = screw/nut friction coefficient</w:t>
       </w:r>
     </w:p>
     <w:p>
-      <w:pPr>
-        <w:pStyle w:val="ListBullet"/>
-      </w:pPr>
       <w:r>
         <w:t>`mu_np` = nut/part friction coefficient</w:t>
       </w:r>
     </w:p>
     <w:p>
-      <w:pPr>
-        <w:pStyle w:val="ListBullet"/>
-      </w:pPr>
       <w:r>
         <w:t>`mu_pp` = part/part friction coefficient</w:t>
       </w:r>
     </w:p>
     <w:p>
-      <w:pPr>
-        <w:pStyle w:val="ListBullet"/>
-      </w:pPr>
       <w:r>
         <w:t>`Tt` = selected tightening torque</w:t>
       </w:r>
     </w:p>
     <w:p>
-      <w:pPr>
-        <w:pStyle w:val="ListBullet"/>
-      </w:pPr>
       <w:r>
         <w:t>`Fv` = axial pretension</w:t>
       </w:r>
@@ -387,16 +267,7 @@
       </w:r>
     </w:p>
     <w:p>
-      <w:pPr>
-        <w:pStyle w:val="FormulaBlock"/>
-        <w:spacing w:before="60" w:after="120"/>
-        <w:ind w:left="259"/>
-      </w:pPr>
       <w:r>
-        <w:rPr>
-          <w:rFonts w:ascii="Courier New" w:hAnsi="Courier New"/>
-          <w:sz w:val="17"/>
-        </w:rPr>
         <w:t>Fv = 1000 * Tt / (0.16 * p + 0.583 * mu_sn * dp + mu_np * Rn)</w:t>
       </w:r>
     </w:p>
@@ -406,16 +277,7 @@
       </w:r>
     </w:p>
     <w:p>
-      <w:pPr>
-        <w:pStyle w:val="FormulaBlock"/>
-        <w:spacing w:before="60" w:after="120"/>
-        <w:ind w:left="259"/>
-      </w:pPr>
       <w:r>
-        <w:rPr>
-          <w:rFonts w:ascii="Courier New" w:hAnsi="Courier New"/>
-          <w:sz w:val="17"/>
-        </w:rPr>
         <w:t>Fv = (%TYS / 100) * As * Sy</w:t>
       </w:r>
     </w:p>
@@ -425,16 +287,7 @@
       </w:r>
     </w:p>
     <w:p>
-      <w:pPr>
-        <w:pStyle w:val="FormulaBlock"/>
-        <w:spacing w:before="60" w:after="120"/>
-        <w:ind w:left="259"/>
-      </w:pPr>
       <w:r>
-        <w:rPr>
-          <w:rFonts w:ascii="Courier New" w:hAnsi="Courier New"/>
-          <w:sz w:val="17"/>
-        </w:rPr>
         <w:t>Tt_reported = (0.16 * p + 0.583 * mu_sn * dp + mu_np * Rn) * Fv / 1000</w:t>
       </w:r>
     </w:p>
@@ -444,16 +297,7 @@
       </w:r>
     </w:p>
     <w:p>
-      <w:pPr>
-        <w:pStyle w:val="FormulaBlock"/>
-        <w:spacing w:before="60" w:after="120"/>
-        <w:ind w:left="259"/>
-      </w:pPr>
       <w:r>
-        <w:rPr>
-          <w:rFonts w:ascii="Courier New" w:hAnsi="Courier New"/>
-          <w:sz w:val="17"/>
-        </w:rPr>
         <w:t>preload_%TYS = Fv / (As * Sy) * 100</w:t>
       </w:r>
     </w:p>
@@ -463,16 +307,7 @@
       </w:r>
     </w:p>
     <w:p>
-      <w:pPr>
-        <w:pStyle w:val="FormulaBlock"/>
-        <w:spacing w:before="60" w:after="120"/>
-        <w:ind w:left="259"/>
-      </w:pPr>
       <w:r>
-        <w:rPr>
-          <w:rFonts w:ascii="Courier New" w:hAnsi="Courier New"/>
-          <w:sz w:val="17"/>
-        </w:rPr>
         <w:t>T_np = mu_np * Rn * Fv / 1000</w:t>
       </w:r>
     </w:p>
@@ -482,16 +317,7 @@
       </w:r>
     </w:p>
     <w:p>
-      <w:pPr>
-        <w:pStyle w:val="FormulaBlock"/>
-        <w:spacing w:before="60" w:after="120"/>
-        <w:ind w:left="259"/>
-      </w:pPr>
       <w:r>
-        <w:rPr>
-          <w:rFonts w:ascii="Courier New" w:hAnsi="Courier New"/>
-          <w:sz w:val="17"/>
-        </w:rPr>
         <w:t>T_torsion = (0.16 * p + 0.583 * mu_sn * dp) * Fv / 1000</w:t>
       </w:r>
     </w:p>
@@ -501,16 +327,7 @@
       </w:r>
     </w:p>
     <w:p>
-      <w:pPr>
-        <w:pStyle w:val="FormulaBlock"/>
-        <w:spacing w:before="60" w:after="120"/>
-        <w:ind w:left="259"/>
-      </w:pPr>
       <w:r>
-        <w:rPr>
-          <w:rFonts w:ascii="Courier New" w:hAnsi="Courier New"/>
-          <w:sz w:val="17"/>
-        </w:rPr>
         <w:t>T_friction = Fv * n * mu_pp * PCD / 2 / 1000</w:t>
       </w:r>
     </w:p>
@@ -520,16 +337,7 @@
       </w:r>
     </w:p>
     <w:p>
-      <w:pPr>
-        <w:pStyle w:val="FormulaBlock"/>
-        <w:spacing w:before="60" w:after="120"/>
-        <w:ind w:left="259"/>
-      </w:pPr>
       <w:r>
-        <w:rPr>
-          <w:rFonts w:ascii="Courier New" w:hAnsi="Courier New"/>
-          <w:sz w:val="17"/>
-        </w:rPr>
         <w:t>ratio_% = T_friction / T_duty * 100</w:t>
       </w:r>
     </w:p>
@@ -540,7 +348,7 @@
     </w:p>
     <w:p>
       <w:pPr>
-        <w:pStyle w:val="Heading2"/>
+        <w:pStyle w:val="Heading1"/>
       </w:pPr>
       <w:r>
         <w:t>5. Duty Torque Cases</w:t>
@@ -552,25 +360,16 @@
       </w:r>
     </w:p>
     <w:p>
-      <w:pPr>
-        <w:pStyle w:val="ListBullet"/>
-      </w:pPr>
       <w:r>
         <w:t>Continuous</w:t>
       </w:r>
     </w:p>
     <w:p>
-      <w:pPr>
-        <w:pStyle w:val="ListBullet"/>
-      </w:pPr>
       <w:r>
         <w:t>Peak</w:t>
       </w:r>
     </w:p>
     <w:p>
-      <w:pPr>
-        <w:pStyle w:val="ListBullet"/>
-      </w:pPr>
       <w:r>
         <w:t>Momentary</w:t>
       </w:r>
@@ -581,16 +380,7 @@
       </w:r>
     </w:p>
     <w:p>
-      <w:pPr>
-        <w:pStyle w:val="FormulaBlock"/>
-        <w:spacing w:before="60" w:after="120"/>
-        <w:ind w:left="259"/>
-      </w:pPr>
       <w:r>
-        <w:rPr>
-          <w:rFonts w:ascii="Courier New" w:hAnsi="Courier New"/>
-          <w:sz w:val="17"/>
-        </w:rPr>
         <w:t>T_residual = max(0, T_duty - T_friction)</w:t>
         <w:br/>
         <w:t>V_total = 2000 * T_residual / (PCD * n)</w:t>
@@ -607,16 +397,7 @@
       </w:r>
     </w:p>
     <w:p>
-      <w:pPr>
-        <w:pStyle w:val="FormulaBlock"/>
-        <w:spacing w:before="60" w:after="120"/>
-        <w:ind w:left="259"/>
-      </w:pPr>
       <w:r>
-        <w:rPr>
-          <w:rFonts w:ascii="Courier New" w:hAnsi="Courier New"/>
-          <w:sz w:val="17"/>
-        </w:rPr>
         <w:t>V_sleeve = V_total * (OD^2 - d^2) / OD^2</w:t>
         <w:br/>
         <w:t>V_bolt = V_total - V_sleeve</w:t>
@@ -628,16 +409,7 @@
       </w:r>
     </w:p>
     <w:p>
-      <w:pPr>
-        <w:pStyle w:val="FormulaBlock"/>
-        <w:spacing w:before="60" w:after="120"/>
-        <w:ind w:left="259"/>
-      </w:pPr>
       <w:r>
-        <w:rPr>
-          <w:rFonts w:ascii="Courier New" w:hAnsi="Courier New"/>
-          <w:sz w:val="17"/>
-        </w:rPr>
         <w:t>V_sleeve = 0</w:t>
         <w:br/>
         <w:t>V_bolt = V_total</w:t>
@@ -645,7 +417,7 @@
     </w:p>
     <w:p>
       <w:pPr>
-        <w:pStyle w:val="Heading2"/>
+        <w:pStyle w:val="Heading1"/>
       </w:pPr>
       <w:r>
         <w:t>6. Sleeve Stress and Safety Factor</w:t>
@@ -662,16 +434,7 @@
       </w:r>
     </w:p>
     <w:p>
-      <w:pPr>
-        <w:pStyle w:val="FormulaBlock"/>
-        <w:spacing w:before="60" w:after="120"/>
-        <w:ind w:left="259"/>
-      </w:pPr>
       <w:r>
-        <w:rPr>
-          <w:rFonts w:ascii="Courier New" w:hAnsi="Courier New"/>
-          <w:sz w:val="17"/>
-        </w:rPr>
         <w:t>I_sleeve = pi / 64 * (OD^4 - d^4)</w:t>
         <w:br/>
         <w:t>sigma_b_sleeve = V_sleeve * Leff * OD / 2 / I_sleeve</w:t>
@@ -683,16 +446,7 @@
       </w:r>
     </w:p>
     <w:p>
-      <w:pPr>
-        <w:pStyle w:val="FormulaBlock"/>
-        <w:spacing w:before="60" w:after="120"/>
-        <w:ind w:left="259"/>
-      </w:pPr>
       <w:r>
-        <w:rPr>
-          <w:rFonts w:ascii="Courier New" w:hAnsi="Courier New"/>
-          <w:sz w:val="17"/>
-        </w:rPr>
         <w:t>tau_sleeve = V_total / (pi / 4 * OD^2)</w:t>
       </w:r>
     </w:p>
@@ -702,16 +456,7 @@
       </w:r>
     </w:p>
     <w:p>
-      <w:pPr>
-        <w:pStyle w:val="FormulaBlock"/>
-        <w:spacing w:before="60" w:after="120"/>
-        <w:ind w:left="259"/>
-      </w:pPr>
       <w:r>
-        <w:rPr>
-          <w:rFonts w:ascii="Courier New" w:hAnsi="Courier New"/>
-          <w:sz w:val="17"/>
-        </w:rPr>
         <w:t>VM_sleeve = sqrt(sigma_b_sleeve^2 + 3 * tau_sleeve^2)</w:t>
       </w:r>
     </w:p>
@@ -721,16 +466,7 @@
       </w:r>
     </w:p>
     <w:p>
-      <w:pPr>
-        <w:pStyle w:val="FormulaBlock"/>
-        <w:spacing w:before="60" w:after="120"/>
-        <w:ind w:left="259"/>
-      </w:pPr>
       <w:r>
-        <w:rPr>
-          <w:rFonts w:ascii="Courier New" w:hAnsi="Courier New"/>
-          <w:sz w:val="17"/>
-        </w:rPr>
         <w:t>SF_sleeve = sleeve_yield / VM_sleeve</w:t>
       </w:r>
     </w:p>
@@ -740,16 +476,7 @@
       </w:r>
     </w:p>
     <w:p>
-      <w:pPr>
-        <w:pStyle w:val="FormulaBlock"/>
-        <w:spacing w:before="60" w:after="120"/>
-        <w:ind w:left="259"/>
-      </w:pPr>
       <w:r>
-        <w:rPr>
-          <w:rFonts w:ascii="Courier New" w:hAnsi="Courier New"/>
-          <w:sz w:val="17"/>
-        </w:rPr>
         <w:t>GMC 0401  = 245 MPa</w:t>
         <w:br/>
         <w:t>GMC 0336  = 650 MPa</w:t>
@@ -764,7 +491,7 @@
     </w:p>
     <w:p>
       <w:pPr>
-        <w:pStyle w:val="Heading2"/>
+        <w:pStyle w:val="Heading1"/>
       </w:pPr>
       <w:r>
         <w:t>7. Bolt Shear/Bending Area Stress and Safety Factor</w:t>
@@ -776,16 +503,7 @@
       </w:r>
     </w:p>
     <w:p>
-      <w:pPr>
-        <w:pStyle w:val="FormulaBlock"/>
-        <w:spacing w:before="60" w:after="120"/>
-        <w:ind w:left="259"/>
-      </w:pPr>
       <w:r>
-        <w:rPr>
-          <w:rFonts w:ascii="Courier New" w:hAnsi="Courier New"/>
-          <w:sz w:val="17"/>
-        </w:rPr>
         <w:t>sigma_axial = 4 * Fv / (pi * dsb^2)</w:t>
       </w:r>
     </w:p>
@@ -795,16 +513,7 @@
       </w:r>
     </w:p>
     <w:p>
-      <w:pPr>
-        <w:pStyle w:val="FormulaBlock"/>
-        <w:spacing w:before="60" w:after="120"/>
-        <w:ind w:left="259"/>
-      </w:pPr>
       <w:r>
-        <w:rPr>
-          <w:rFonts w:ascii="Courier New" w:hAnsi="Courier New"/>
-          <w:sz w:val="17"/>
-        </w:rPr>
         <w:t>I_bolt = pi / 64 * dsb^4</w:t>
         <w:br/>
         <w:t>sigma_b_bolt = V_bolt * Leff * dsb / 2 / I_bolt</w:t>
@@ -816,16 +525,7 @@
       </w:r>
     </w:p>
     <w:p>
-      <w:pPr>
-        <w:pStyle w:val="FormulaBlock"/>
-        <w:spacing w:before="60" w:after="120"/>
-        <w:ind w:left="259"/>
-      </w:pPr>
       <w:r>
-        <w:rPr>
-          <w:rFonts w:ascii="Courier New" w:hAnsi="Courier New"/>
-          <w:sz w:val="17"/>
-        </w:rPr>
         <w:t>tau_bolt = V_bolt / (pi / 4 * dsb^2)</w:t>
       </w:r>
     </w:p>
@@ -835,16 +535,7 @@
       </w:r>
     </w:p>
     <w:p>
-      <w:pPr>
-        <w:pStyle w:val="FormulaBlock"/>
-        <w:spacing w:before="60" w:after="120"/>
-        <w:ind w:left="259"/>
-      </w:pPr>
       <w:r>
-        <w:rPr>
-          <w:rFonts w:ascii="Courier New" w:hAnsi="Courier New"/>
-          <w:sz w:val="17"/>
-        </w:rPr>
         <w:t>VM_bolt = sqrt((sigma_axial + sigma_b_bolt)^2 + 3 * tau_bolt^2)</w:t>
       </w:r>
     </w:p>
@@ -854,16 +545,7 @@
       </w:r>
     </w:p>
     <w:p>
-      <w:pPr>
-        <w:pStyle w:val="FormulaBlock"/>
-        <w:spacing w:before="60" w:after="120"/>
-        <w:ind w:left="259"/>
-      </w:pPr>
       <w:r>
-        <w:rPr>
-          <w:rFonts w:ascii="Courier New" w:hAnsi="Courier New"/>
-          <w:sz w:val="17"/>
-        </w:rPr>
         <w:t>SF_bolt = Sy / VM_bolt</w:t>
       </w:r>
     </w:p>
@@ -874,7 +556,7 @@
     </w:p>
     <w:p>
       <w:pPr>
-        <w:pStyle w:val="Heading2"/>
+        <w:pStyle w:val="Heading1"/>
       </w:pPr>
       <w:r>
         <w:t>8. Assembly Stress in Groove Area</w:t>
@@ -891,16 +573,7 @@
       </w:r>
     </w:p>
     <w:p>
-      <w:pPr>
-        <w:pStyle w:val="FormulaBlock"/>
-        <w:spacing w:before="60" w:after="120"/>
-        <w:ind w:left="259"/>
-      </w:pPr>
       <w:r>
-        <w:rPr>
-          <w:rFonts w:ascii="Courier New" w:hAnsi="Courier New"/>
-          <w:sz w:val="17"/>
-        </w:rPr>
         <w:t>sigma_groove = 4 * Fv / (pi * dg^2)</w:t>
       </w:r>
     </w:p>
@@ -910,16 +583,7 @@
       </w:r>
     </w:p>
     <w:p>
-      <w:pPr>
-        <w:pStyle w:val="FormulaBlock"/>
-        <w:spacing w:before="60" w:after="120"/>
-        <w:ind w:left="259"/>
-      </w:pPr>
       <w:r>
-        <w:rPr>
-          <w:rFonts w:ascii="Courier New" w:hAnsi="Courier New"/>
-          <w:sz w:val="17"/>
-        </w:rPr>
         <w:t>tau_groove = 16 * T_torsion * 1000 / (pi * dg^3)</w:t>
       </w:r>
     </w:p>
@@ -929,16 +593,7 @@
       </w:r>
     </w:p>
     <w:p>
-      <w:pPr>
-        <w:pStyle w:val="FormulaBlock"/>
-        <w:spacing w:before="60" w:after="120"/>
-        <w:ind w:left="259"/>
-      </w:pPr>
       <w:r>
-        <w:rPr>
-          <w:rFonts w:ascii="Courier New" w:hAnsi="Courier New"/>
-          <w:sz w:val="17"/>
-        </w:rPr>
         <w:t>VM_groove = sqrt(sigma_groove^2 + 3 * tau_groove^2)</w:t>
       </w:r>
     </w:p>
@@ -948,22 +603,13 @@
       </w:r>
     </w:p>
     <w:p>
-      <w:pPr>
-        <w:pStyle w:val="FormulaBlock"/>
-        <w:spacing w:before="60" w:after="120"/>
-        <w:ind w:left="259"/>
-      </w:pPr>
       <w:r>
-        <w:rPr>
-          <w:rFonts w:ascii="Courier New" w:hAnsi="Courier New"/>
-          <w:sz w:val="17"/>
-        </w:rPr>
         <w:t>SF_groove = Sy / VM_groove</w:t>
       </w:r>
     </w:p>
     <w:p>
       <w:pPr>
-        <w:pStyle w:val="Heading2"/>
+        <w:pStyle w:val="Heading1"/>
       </w:pPr>
       <w:r>
         <w:t>9. Assembly Stress in Thread Root Area</w:t>
@@ -975,16 +621,7 @@
       </w:r>
     </w:p>
     <w:p>
-      <w:pPr>
-        <w:pStyle w:val="FormulaBlock"/>
-        <w:spacing w:before="60" w:after="120"/>
-        <w:ind w:left="259"/>
-      </w:pPr>
       <w:r>
-        <w:rPr>
-          <w:rFonts w:ascii="Courier New" w:hAnsi="Courier New"/>
-          <w:sz w:val="17"/>
-        </w:rPr>
         <w:t>sigma_thread = Fv / As</w:t>
       </w:r>
     </w:p>
@@ -994,16 +631,7 @@
       </w:r>
     </w:p>
     <w:p>
-      <w:pPr>
-        <w:pStyle w:val="FormulaBlock"/>
-        <w:spacing w:before="60" w:after="120"/>
-        <w:ind w:left="259"/>
-      </w:pPr>
       <w:r>
-        <w:rPr>
-          <w:rFonts w:ascii="Courier New" w:hAnsi="Courier New"/>
-          <w:sz w:val="17"/>
-        </w:rPr>
         <w:t>tau_thread = T_torsion * 1000 * dr / 2 / (pi / 32 * dr^4)</w:t>
       </w:r>
     </w:p>
@@ -1013,16 +641,7 @@
       </w:r>
     </w:p>
     <w:p>
-      <w:pPr>
-        <w:pStyle w:val="FormulaBlock"/>
-        <w:spacing w:before="60" w:after="120"/>
-        <w:ind w:left="259"/>
-      </w:pPr>
       <w:r>
-        <w:rPr>
-          <w:rFonts w:ascii="Courier New" w:hAnsi="Courier New"/>
-          <w:sz w:val="17"/>
-        </w:rPr>
         <w:t>VM_thread = sqrt(sigma_thread^2 + 3 * tau_thread^2)</w:t>
       </w:r>
     </w:p>
@@ -1032,22 +651,13 @@
       </w:r>
     </w:p>
     <w:p>
-      <w:pPr>
-        <w:pStyle w:val="FormulaBlock"/>
-        <w:spacing w:before="60" w:after="120"/>
-        <w:ind w:left="259"/>
-      </w:pPr>
       <w:r>
-        <w:rPr>
-          <w:rFonts w:ascii="Courier New" w:hAnsi="Courier New"/>
-          <w:sz w:val="17"/>
-        </w:rPr>
         <w:t>SF_thread_root = Sy / VM_thread</w:t>
       </w:r>
     </w:p>
     <w:p>
       <w:pPr>
-        <w:pStyle w:val="Heading2"/>
+        <w:pStyle w:val="Heading1"/>
       </w:pPr>
       <w:r>
         <w:t>10. Thread Pull-Out Stress</w:t>
@@ -1059,16 +669,7 @@
       </w:r>
     </w:p>
     <w:p>
-      <w:pPr>
-        <w:pStyle w:val="FormulaBlock"/>
-        <w:spacing w:before="60" w:after="120"/>
-        <w:ind w:left="259"/>
-      </w:pPr>
       <w:r>
-        <w:rPr>
-          <w:rFonts w:ascii="Courier New" w:hAnsi="Courier New"/>
-          <w:sz w:val="17"/>
-        </w:rPr>
         <w:t>L = user-entered engagement</w:t>
         <w:br/>
         <w:t>L = 1.2 * d    when thread engagement mode is Thread/default</w:t>
@@ -1080,16 +681,7 @@
       </w:r>
     </w:p>
     <w:p>
-      <w:pPr>
-        <w:pStyle w:val="FormulaBlock"/>
-        <w:spacing w:before="60" w:after="120"/>
-        <w:ind w:left="259"/>
-      </w:pPr>
       <w:r>
-        <w:rPr>
-          <w:rFonts w:ascii="Courier New" w:hAnsi="Courier New"/>
-          <w:sz w:val="17"/>
-        </w:rPr>
         <w:t>A_pullout = pi / 2 * dp * L</w:t>
       </w:r>
     </w:p>
@@ -1099,16 +691,7 @@
       </w:r>
     </w:p>
     <w:p>
-      <w:pPr>
-        <w:pStyle w:val="FormulaBlock"/>
-        <w:spacing w:before="60" w:after="120"/>
-        <w:ind w:left="259"/>
-      </w:pPr>
       <w:r>
-        <w:rPr>
-          <w:rFonts w:ascii="Courier New" w:hAnsi="Courier New"/>
-          <w:sz w:val="17"/>
-        </w:rPr>
         <w:t>N_engaged = L / p</w:t>
       </w:r>
     </w:p>
@@ -1118,16 +701,7 @@
       </w:r>
     </w:p>
     <w:p>
-      <w:pPr>
-        <w:pStyle w:val="FormulaBlock"/>
-        <w:spacing w:before="60" w:after="120"/>
-        <w:ind w:left="259"/>
-      </w:pPr>
       <w:r>
-        <w:rPr>
-          <w:rFonts w:ascii="Courier New" w:hAnsi="Courier New"/>
-          <w:sz w:val="17"/>
-        </w:rPr>
         <w:t>K = max(1,</w:t>
         <w:br/>
         <w:t xml:space="preserve">        0.001762 * N_engaged^3</w:t>
@@ -1145,16 +719,7 @@
       </w:r>
     </w:p>
     <w:p>
-      <w:pPr>
-        <w:pStyle w:val="FormulaBlock"/>
-        <w:spacing w:before="60" w:after="120"/>
-        <w:ind w:left="259"/>
-      </w:pPr>
       <w:r>
-        <w:rPr>
-          <w:rFonts w:ascii="Courier New" w:hAnsi="Courier New"/>
-          <w:sz w:val="17"/>
-        </w:rPr>
         <w:t>K = max(1,</w:t>
         <w:br/>
         <w:t xml:space="preserve">        0.002317 * N_engaged^3</w:t>
@@ -1172,16 +737,7 @@
       </w:r>
     </w:p>
     <w:p>
-      <w:pPr>
-        <w:pStyle w:val="FormulaBlock"/>
-        <w:spacing w:before="60" w:after="120"/>
-        <w:ind w:left="259"/>
-      </w:pPr>
       <w:r>
-        <w:rPr>
-          <w:rFonts w:ascii="Courier New" w:hAnsi="Courier New"/>
-          <w:sz w:val="17"/>
-        </w:rPr>
         <w:t>sigma_pullout = Fv / A_pullout * K</w:t>
       </w:r>
     </w:p>
@@ -1192,7 +748,7 @@
     </w:p>
     <w:p>
       <w:pPr>
-        <w:pStyle w:val="Heading2"/>
+        <w:pStyle w:val="Heading1"/>
       </w:pPr>
       <w:r>
         <w:t>11. Minimum Safety Factor</w:t>
@@ -1204,16 +760,7 @@
       </w:r>
     </w:p>
     <w:p>
-      <w:pPr>
-        <w:pStyle w:val="FormulaBlock"/>
-        <w:spacing w:before="60" w:after="120"/>
-        <w:ind w:left="259"/>
-      </w:pPr>
       <w:r>
-        <w:rPr>
-          <w:rFonts w:ascii="Courier New" w:hAnsi="Courier New"/>
-          <w:sz w:val="17"/>
-        </w:rPr>
         <w:t>minimum_SF = min(</w:t>
         <w:br/>
         <w:t xml:space="preserve">    all bolt shear/bending SF values,</w:t>
@@ -1229,16 +776,13 @@
     </w:p>
     <w:p>
       <w:pPr>
-        <w:pStyle w:val="Heading2"/>
+        <w:pStyle w:val="Heading1"/>
       </w:pPr>
       <w:r>
         <w:t>12. Checking Criteria</w:t>
       </w:r>
     </w:p>
     <w:p>
-      <w:pPr>
-        <w:pStyle w:val="Heading3"/>
-      </w:pPr>
       <w:r>
         <w:t>12.1 API 671 5th Edition</w:t>
       </w:r>
@@ -1249,16 +793,7 @@
       </w:r>
     </w:p>
     <w:p>
-      <w:pPr>
-        <w:pStyle w:val="FormulaBlock"/>
-        <w:spacing w:before="60" w:after="120"/>
-        <w:ind w:left="259"/>
-      </w:pPr>
       <w:r>
-        <w:rPr>
-          <w:rFonts w:ascii="Courier New" w:hAnsi="Courier New"/>
-          <w:sz w:val="17"/>
-        </w:rPr>
         <w:t>Continuous torque: SF &gt;= 1.50</w:t>
         <w:br/>
         <w:t>Peak torque:       SF &gt;= 1.15</w:t>
@@ -1267,9 +802,6 @@
       </w:r>
     </w:p>
     <w:p>
-      <w:pPr>
-        <w:pStyle w:val="Heading3"/>
-      </w:pPr>
       <w:r>
         <w:t>12.2 API 671 4th Edition</w:t>
       </w:r>
@@ -1280,16 +812,7 @@
       </w:r>
     </w:p>
     <w:p>
-      <w:pPr>
-        <w:pStyle w:val="FormulaBlock"/>
-        <w:spacing w:before="60" w:after="120"/>
-        <w:ind w:left="259"/>
-      </w:pPr>
       <w:r>
-        <w:rPr>
-          <w:rFonts w:ascii="Courier New" w:hAnsi="Courier New"/>
-          <w:sz w:val="17"/>
-        </w:rPr>
         <w:t>Continuous torque: SF &gt;= 1.25</w:t>
         <w:br/>
         <w:t>Peak torque:       SF &gt;= 1.15</w:t>
@@ -1298,46 +821,22 @@
       </w:r>
     </w:p>
     <w:p>
-      <w:pPr>
-        <w:pStyle w:val="Heading3"/>
-      </w:pPr>
       <w:r>
         <w:t>12.3 Groove Area</w:t>
       </w:r>
     </w:p>
     <w:p>
-      <w:pPr>
-        <w:pStyle w:val="FormulaBlock"/>
-        <w:spacing w:before="60" w:after="120"/>
-        <w:ind w:left="259"/>
-      </w:pPr>
       <w:r>
-        <w:rPr>
-          <w:rFonts w:ascii="Courier New" w:hAnsi="Courier New"/>
-          <w:sz w:val="17"/>
-        </w:rPr>
         <w:t>SF_groove &gt;= 1.10</w:t>
       </w:r>
     </w:p>
     <w:p>
-      <w:pPr>
-        <w:pStyle w:val="Heading3"/>
-      </w:pPr>
       <w:r>
         <w:t>12.4 Thread Root Area</w:t>
       </w:r>
     </w:p>
     <w:p>
-      <w:pPr>
-        <w:pStyle w:val="FormulaBlock"/>
-        <w:spacing w:before="60" w:after="120"/>
-        <w:ind w:left="259"/>
-      </w:pPr>
       <w:r>
-        <w:rPr>
-          <w:rFonts w:ascii="Courier New" w:hAnsi="Courier New"/>
-          <w:sz w:val="17"/>
-        </w:rPr>
         <w:t>SF_thread_root &gt;= 1.00 required</w:t>
         <w:br/>
         <w:t>SF_thread_root &gt;= 1.10 preferred</w:t>
@@ -1349,24 +848,12 @@
       </w:r>
     </w:p>
     <w:p>
-      <w:pPr>
-        <w:pStyle w:val="Heading3"/>
-      </w:pPr>
       <w:r>
         <w:t>12.5 Tightening Preload Percent</w:t>
       </w:r>
     </w:p>
     <w:p>
-      <w:pPr>
-        <w:pStyle w:val="FormulaBlock"/>
-        <w:spacing w:before="60" w:after="120"/>
-        <w:ind w:left="259"/>
-      </w:pPr>
       <w:r>
-        <w:rPr>
-          <w:rFonts w:ascii="Courier New" w:hAnsi="Courier New"/>
-          <w:sz w:val="17"/>
-        </w:rPr>
         <w:t>Stripper bolt: preload_%TYS &lt;= 60</w:t>
         <w:br/>
         <w:t>Shim:          preload_%TYS &lt;= 60</w:t>
@@ -1375,24 +862,12 @@
       </w:r>
     </w:p>
     <w:p>
-      <w:pPr>
-        <w:pStyle w:val="Heading3"/>
-      </w:pPr>
       <w:r>
         <w:t>12.6 Thread Pull-Out</w:t>
       </w:r>
     </w:p>
     <w:p>
-      <w:pPr>
-        <w:pStyle w:val="FormulaBlock"/>
-        <w:spacing w:before="60" w:after="120"/>
-        <w:ind w:left="259"/>
-      </w:pPr>
       <w:r>
-        <w:rPr>
-          <w:rFonts w:ascii="Courier New" w:hAnsi="Courier New"/>
-          <w:sz w:val="17"/>
-        </w:rPr>
         <w:t>tapped_hole_yield &gt;= sigma_pullout</w:t>
       </w:r>
     </w:p>
@@ -1403,7 +878,7 @@
     </w:p>
     <w:p>
       <w:pPr>
-        <w:pStyle w:val="Heading2"/>
+        <w:pStyle w:val="Heading1"/>
       </w:pPr>
       <w:r>
         <w:t>13. Input Validation</w:t>
@@ -1415,120 +890,78 @@
       </w:r>
     </w:p>
     <w:p>
-      <w:pPr>
-        <w:pStyle w:val="ListBullet"/>
-      </w:pPr>
       <w:r>
         <w:t>`PCD &gt; 0`</w:t>
       </w:r>
     </w:p>
     <w:p>
-      <w:pPr>
-        <w:pStyle w:val="ListBullet"/>
-      </w:pPr>
       <w:r>
         <w:t>`screw_count &gt;= 1`</w:t>
       </w:r>
     </w:p>
     <w:p>
-      <w:pPr>
-        <w:pStyle w:val="ListBullet"/>
-      </w:pPr>
       <w:r>
         <w:t>`thread &gt; 0`</w:t>
       </w:r>
     </w:p>
     <w:p>
-      <w:pPr>
-        <w:pStyle w:val="ListBullet"/>
-      </w:pPr>
       <w:r>
         <w:t>`pitch &gt; 0`</w:t>
       </w:r>
     </w:p>
     <w:p>
-      <w:pPr>
-        <w:pStyle w:val="ListBullet"/>
-      </w:pPr>
       <w:r>
         <w:t>checking standard must be recognized</w:t>
       </w:r>
     </w:p>
     <w:p>
-      <w:pPr>
-        <w:pStyle w:val="ListBullet"/>
-      </w:pPr>
       <w:r>
         <w:t>joint type must be recognized</w:t>
       </w:r>
     </w:p>
     <w:p>
-      <w:pPr>
-        <w:pStyle w:val="ListBullet"/>
-      </w:pPr>
       <w:r>
         <w:t>pack thickness must be zero or positive</w:t>
       </w:r>
     </w:p>
     <w:p>
-      <w:pPr>
-        <w:pStyle w:val="ListBullet"/>
-      </w:pPr>
       <w:r>
         <w:t>Drive bolt and Shim require positive pack thickness</w:t>
       </w:r>
     </w:p>
     <w:p>
-      <w:pPr>
-        <w:pStyle w:val="ListBullet"/>
-      </w:pPr>
       <w:r>
         <w:t>contact diameter must be greater than zero</w:t>
       </w:r>
     </w:p>
     <w:p>
-      <w:pPr>
-        <w:pStyle w:val="ListBullet"/>
-      </w:pPr>
       <w:r>
         <w:t>tightening torque and `% TYS` cannot both be entered</w:t>
       </w:r>
     </w:p>
     <w:p>
-      <w:pPr>
-        <w:pStyle w:val="ListBullet"/>
-      </w:pPr>
       <w:r>
         <w:t>screw/nut, nut/part, and part/part friction coefficients must be greater than zero</w:t>
       </w:r>
     </w:p>
     <w:p>
-      <w:pPr>
-        <w:pStyle w:val="ListBullet"/>
-      </w:pPr>
       <w:r>
         <w:t>sleeve OD must be zero or positive</w:t>
       </w:r>
     </w:p>
     <w:p>
-      <w:pPr>
-        <w:pStyle w:val="ListBullet"/>
-      </w:pPr>
       <w:r>
         <w:t>tapped-hole yield must be zero or positive</w:t>
       </w:r>
     </w:p>
     <w:p>
-      <w:pPr>
-        <w:pStyle w:val="ListBullet"/>
-      </w:pPr>
       <w:r>
         <w:t>lever arm must be zero or positive</w:t>
       </w:r>
     </w:p>
     <w:p>
       <w:pPr>
-        <w:pStyle w:val="Heading2"/>
+        <w:pStyle w:val="Heading1"/>
       </w:pPr>
       <w:r>
         <w:t>14. Legacy Quick Friction Model Appendix</w:t>
@@ -1545,16 +978,7 @@
       </w:r>
     </w:p>
     <w:p>
-      <w:pPr>
-        <w:pStyle w:val="FormulaBlock"/>
-        <w:spacing w:before="60" w:after="120"/>
-        <w:ind w:left="259"/>
-      </w:pPr>
       <w:r>
-        <w:rPr>
-          <w:rFonts w:ascii="Courier New" w:hAnsi="Courier New"/>
-          <w:sz w:val="17"/>
-        </w:rPr>
         <w:t>r_eff = (inner_radius + outer_radius) / 2</w:t>
       </w:r>
     </w:p>
@@ -1564,16 +988,7 @@
       </w:r>
     </w:p>
     <w:p>
-      <w:pPr>
-        <w:pStyle w:val="FormulaBlock"/>
-        <w:spacing w:before="60" w:after="120"/>
-        <w:ind w:left="259"/>
-      </w:pPr>
       <w:r>
-        <w:rPr>
-          <w:rFonts w:ascii="Courier New" w:hAnsi="Courier New"/>
-          <w:sz w:val="17"/>
-        </w:rPr>
         <w:t>r_eff = (2 / 3) * ((outer_radius^3 - inner_radius^3) /</w:t>
         <w:br/>
         <w:t xml:space="preserve">                   (outer_radius^2 - inner_radius^2))</w:t>
@@ -1585,16 +1000,7 @@
       </w:r>
     </w:p>
     <w:p>
-      <w:pPr>
-        <w:pStyle w:val="FormulaBlock"/>
-        <w:spacing w:before="60" w:after="120"/>
-        <w:ind w:left="259"/>
-      </w:pPr>
       <w:r>
-        <w:rPr>
-          <w:rFonts w:ascii="Courier New" w:hAnsi="Courier New"/>
-          <w:sz w:val="17"/>
-        </w:rPr>
         <w:t>T_steady = transmitted_torque * service_factor</w:t>
         <w:br/>
         <w:t>T_design = max(T_steady, cyclic_torque, transient_torque)</w:t>
@@ -1606,16 +1012,7 @@
       </w:r>
     </w:p>
     <w:p>
-      <w:pPr>
-        <w:pStyle w:val="FormulaBlock"/>
-        <w:spacing w:before="60" w:after="120"/>
-        <w:ind w:left="259"/>
-      </w:pPr>
       <w:r>
-        <w:rPr>
-          <w:rFonts w:ascii="Courier New" w:hAnsi="Courier New"/>
-          <w:sz w:val="17"/>
-        </w:rPr>
         <w:t>F_residual = F_initial * (1 - preload_loss_percent / 100)</w:t>
       </w:r>
     </w:p>
@@ -1625,16 +1022,7 @@
       </w:r>
     </w:p>
     <w:p>
-      <w:pPr>
-        <w:pStyle w:val="FormulaBlock"/>
-        <w:spacing w:before="60" w:after="120"/>
-        <w:ind w:left="259"/>
-      </w:pPr>
       <w:r>
-        <w:rPr>
-          <w:rFonts w:ascii="Courier New" w:hAnsi="Courier New"/>
-          <w:sz w:val="17"/>
-        </w:rPr>
         <w:t>T_slip = mu * (F_residual * bolt_count) * r_eff * friction_interfaces / 1000</w:t>
         <w:br/>
         <w:t>SF_slip = T_slip / T_design</w:t>
@@ -1646,16 +1034,7 @@
       </w:r>
     </w:p>
     <w:p>
-      <w:pPr>
-        <w:pStyle w:val="FormulaBlock"/>
-        <w:spacing w:before="60" w:after="120"/>
-        <w:ind w:left="259"/>
-      </w:pPr>
       <w:r>
-        <w:rPr>
-          <w:rFonts w:ascii="Courier New" w:hAnsi="Courier New"/>
-          <w:sz w:val="17"/>
-        </w:rPr>
         <w:t>F_required_total = T_design * 1000 / (mu * r_eff * friction_interfaces)</w:t>
         <w:br/>
         <w:t>F_required_per_bolt = F_required_total / bolt_count</w:t>
@@ -1669,16 +1048,7 @@
       </w:r>
     </w:p>
     <w:p>
-      <w:pPr>
-        <w:pStyle w:val="FormulaBlock"/>
-        <w:spacing w:before="60" w:after="120"/>
-        <w:ind w:left="259"/>
-      </w:pPr>
       <w:r>
-        <w:rPr>
-          <w:rFonts w:ascii="Courier New" w:hAnsi="Courier New"/>
-          <w:sz w:val="17"/>
-        </w:rPr>
         <w:t>F_yield = yield_strength * tensile_area</w:t>
         <w:br/>
         <w:t>F_proof = proof_strength * tensile_area</w:t>
@@ -1690,16 +1060,7 @@
       </w:r>
     </w:p>
     <w:p>
-      <w:pPr>
-        <w:pStyle w:val="FormulaBlock"/>
-        <w:spacing w:before="60" w:after="120"/>
-        <w:ind w:left="259"/>
-      </w:pPr>
       <w:r>
-        <w:rPr>
-          <w:rFonts w:ascii="Courier New" w:hAnsi="Courier New"/>
-          <w:sz w:val="17"/>
-        </w:rPr>
         <w:t>phi = k_bolt / (k_bolt + k_joint)</w:t>
         <w:br/>
         <w:t>F_bolt_service = F_residual + phi * F_axial</w:t>
@@ -1713,16 +1074,7 @@
       </w:r>
     </w:p>
     <w:p>
-      <w:pPr>
-        <w:pStyle w:val="FormulaBlock"/>
-        <w:spacing w:before="60" w:after="120"/>
-        <w:ind w:left="259"/>
-      </w:pPr>
       <w:r>
-        <w:rPr>
-          <w:rFonts w:ascii="Courier New" w:hAnsi="Courier New"/>
-          <w:sz w:val="17"/>
-        </w:rPr>
         <w:t>assembly_yield_utilization = F_initial / F_yield</w:t>
         <w:br/>
         <w:t>service_yield_utilization = F_bolt_service / F_yield</w:t>
@@ -1735,14 +1087,1738 @@
         <w:t>Legacy quick model warnings include low service factor, transient/cyclic torque governing, slip capacity below demand, preload/yield utilization above the selected limit, preload above proof load, and joint separation.</w:t>
       </w:r>
     </w:p>
+    <w:p>
+      <w:pPr>
+        <w:pStyle w:val="Heading1"/>
+      </w:pPr>
+      <w:r>
+        <w:t>15. Spreadsheet Cell Cross-Reference</w:t>
+      </w:r>
+    </w:p>
+    <w:p>
+      <w:r>
+        <w:t>The following table cross-references the procedure formulas to the source CTP0007 spreadsheet cells. References are from the template workbook: C:\Users\jtpkyyu\Smiths Group\Engineering Couplings - Coupling Technical Programs (CTP)\CTP 0007.xltx</w:t>
+      </w:r>
+    </w:p>
+    <w:p>
+      <w:r>
+        <w:t>Where the app intentionally extends the spreadsheet, the table identifies the original source cell for the calculated value and notes the app-specific control or criterion.</w:t>
+      </w:r>
+    </w:p>
+    <w:tbl>
+      <w:tblPr>
+        <w:tblStyle w:val="TableGrid"/>
+        <w:tblW w:type="auto" w:w="0"/>
+        <w:tblLayout w:type="autofit"/>
+        <w:tblLook w:firstColumn="1" w:firstRow="1" w:lastColumn="0" w:lastRow="0" w:noHBand="0" w:noVBand="1" w:val="04A0"/>
+      </w:tblPr>
+      <w:tblGrid>
+        <w:gridCol w:w="3636"/>
+        <w:gridCol w:w="3636"/>
+        <w:gridCol w:w="3636"/>
+        <w:gridCol w:w="3636"/>
+      </w:tblGrid>
+      <w:tr>
+        <w:tc>
+          <w:tcPr>
+            <w:tcW w:type="dxa" w:w="3636"/>
+          </w:tcPr>
+          <w:p>
+            <w:r>
+              <w:rPr>
+                <w:b/>
+              </w:rPr>
+              <w:t>Procedure topic</w:t>
+            </w:r>
+          </w:p>
+        </w:tc>
+        <w:tc>
+          <w:tcPr>
+            <w:tcW w:type="dxa" w:w="3636"/>
+          </w:tcPr>
+          <w:p>
+            <w:r>
+              <w:rPr>
+                <w:b/>
+              </w:rPr>
+              <w:t>Formula/result in this procedure</w:t>
+            </w:r>
+          </w:p>
+        </w:tc>
+        <w:tc>
+          <w:tcPr>
+            <w:tcW w:type="dxa" w:w="3636"/>
+          </w:tcPr>
+          <w:p>
+            <w:r>
+              <w:rPr>
+                <w:b/>
+              </w:rPr>
+              <w:t>CTP0007 spreadsheet cells</w:t>
+            </w:r>
+          </w:p>
+        </w:tc>
+        <w:tc>
+          <w:tcPr>
+            <w:tcW w:type="dxa" w:w="3636"/>
+          </w:tcPr>
+          <w:p>
+            <w:r>
+              <w:rPr>
+                <w:b/>
+              </w:rPr>
+              <w:t>Notes</w:t>
+            </w:r>
+          </w:p>
+        </w:tc>
+      </w:tr>
+      <w:tr>
+        <w:tc>
+          <w:tcPr>
+            <w:tcW w:type="dxa" w:w="3636"/>
+          </w:tcPr>
+          <w:p>
+            <w:r>
+              <w:rPr>
+                <w:rFonts w:ascii="Arial" w:hAnsi="Arial"/>
+                <w:sz w:val="14"/>
+              </w:rPr>
+              <w:t>Reference workbook</w:t>
+            </w:r>
+          </w:p>
+        </w:tc>
+        <w:tc>
+          <w:tcPr>
+            <w:tcW w:type="dxa" w:w="3636"/>
+          </w:tcPr>
+          <w:p>
+            <w:r>
+              <w:rPr>
+                <w:rFonts w:ascii="Arial" w:hAnsi="Arial"/>
+                <w:sz w:val="14"/>
+              </w:rPr>
+              <w:t>Cross-reference source for the procedure</w:t>
+            </w:r>
+          </w:p>
+        </w:tc>
+        <w:tc>
+          <w:tcPr>
+            <w:tcW w:type="dxa" w:w="3636"/>
+          </w:tcPr>
+          <w:p>
+            <w:r>
+              <w:rPr>
+                <w:rFonts w:ascii="Arial" w:hAnsi="Arial"/>
+                <w:sz w:val="14"/>
+              </w:rPr>
+              <w:t>Workbook: C:\Users\jtpkyyu\Smiths Group\Engineering Couplings - Coupling Technical Programs (CTP)\CTP 0007.xltx</w:t>
+            </w:r>
+          </w:p>
+        </w:tc>
+        <w:tc>
+          <w:tcPr>
+            <w:tcW w:type="dxa" w:w="3636"/>
+          </w:tcPr>
+          <w:p>
+            <w:r>
+              <w:rPr>
+                <w:rFonts w:ascii="Arial" w:hAnsi="Arial"/>
+                <w:sz w:val="14"/>
+              </w:rPr>
+              <w:t>Template sheets used: CTP 0007, Donn?es Vis, CTM 33 30 10, Bolt Bending, Sleeve Bending.</w:t>
+            </w:r>
+          </w:p>
+        </w:tc>
+      </w:tr>
+      <w:tr>
+        <w:tc>
+          <w:tcPr>
+            <w:tcW w:type="dxa" w:w="3636"/>
+          </w:tcPr>
+          <w:p>
+            <w:r>
+              <w:rPr>
+                <w:rFonts w:ascii="Arial" w:hAnsi="Arial"/>
+                <w:sz w:val="14"/>
+              </w:rPr>
+              <w:t>Screw type and size lookup</w:t>
+            </w:r>
+          </w:p>
+        </w:tc>
+        <w:tc>
+          <w:tcPr>
+            <w:tcW w:type="dxa" w:w="3636"/>
+          </w:tcPr>
+          <w:p>
+            <w:r>
+              <w:rPr>
+                <w:rFonts w:ascii="Arial" w:hAnsi="Arial"/>
+                <w:sz w:val="14"/>
+              </w:rPr>
+              <w:t>Selected Type and Size drive default bolt geometry and standard torque</w:t>
+            </w:r>
+          </w:p>
+        </w:tc>
+        <w:tc>
+          <w:tcPr>
+            <w:tcW w:type="dxa" w:w="3636"/>
+          </w:tcPr>
+          <w:p>
+            <w:r>
+              <w:rPr>
+                <w:rFonts w:ascii="Arial" w:hAnsi="Arial"/>
+                <w:sz w:val="14"/>
+              </w:rPr>
+              <w:t>CTP 0007!A14, E14; Donn?es Vis!B3:X168; formulas CTP 0007!U22, U23, U30, U31, U35, U37</w:t>
+            </w:r>
+          </w:p>
+        </w:tc>
+        <w:tc>
+          <w:tcPr>
+            <w:tcW w:type="dxa" w:w="3636"/>
+          </w:tcPr>
+          <w:p>
+            <w:r>
+              <w:rPr>
+                <w:rFonts w:ascii="Arial" w:hAnsi="Arial"/>
+                <w:sz w:val="14"/>
+              </w:rPr>
+              <w:t>The app database is seeded from the hidden Donn?es Vis screw rows and lets SPECIAL geometry be entered manually.</w:t>
+            </w:r>
+          </w:p>
+        </w:tc>
+      </w:tr>
+      <w:tr>
+        <w:tc>
+          <w:tcPr>
+            <w:tcW w:type="dxa" w:w="3636"/>
+          </w:tcPr>
+          <w:p>
+            <w:r>
+              <w:rPr>
+                <w:rFonts w:ascii="Arial" w:hAnsi="Arial"/>
+                <w:sz w:val="14"/>
+              </w:rPr>
+              <w:t>Basic joint inputs</w:t>
+            </w:r>
+          </w:p>
+        </w:tc>
+        <w:tc>
+          <w:tcPr>
+            <w:tcW w:type="dxa" w:w="3636"/>
+          </w:tcPr>
+          <w:p>
+            <w:r>
+              <w:rPr>
+                <w:rFonts w:ascii="Arial" w:hAnsi="Arial"/>
+                <w:sz w:val="14"/>
+              </w:rPr>
+              <w:t>PCD, screw count, material, and optional manual TYS</w:t>
+            </w:r>
+          </w:p>
+        </w:tc>
+        <w:tc>
+          <w:tcPr>
+            <w:tcW w:type="dxa" w:w="3636"/>
+          </w:tcPr>
+          <w:p>
+            <w:r>
+              <w:rPr>
+                <w:rFonts w:ascii="Arial" w:hAnsi="Arial"/>
+                <w:sz w:val="14"/>
+              </w:rPr>
+              <w:t>CTP 0007!I14, N14, R14, X14</w:t>
+            </w:r>
+          </w:p>
+        </w:tc>
+        <w:tc>
+          <w:tcPr>
+            <w:tcW w:type="dxa" w:w="3636"/>
+          </w:tcPr>
+          <w:p>
+            <w:r>
+              <w:rPr>
+                <w:rFonts w:ascii="Arial" w:hAnsi="Arial"/>
+                <w:sz w:val="14"/>
+              </w:rPr>
+              <w:t>The app labels X14 as editable TYS MPa; if blank, material yield comes from the database.</w:t>
+            </w:r>
+          </w:p>
+        </w:tc>
+      </w:tr>
+      <w:tr>
+        <w:tc>
+          <w:tcPr>
+            <w:tcW w:type="dxa" w:w="3636"/>
+          </w:tcPr>
+          <w:p>
+            <w:r>
+              <w:rPr>
+                <w:rFonts w:ascii="Arial" w:hAnsi="Arial"/>
+                <w:sz w:val="14"/>
+              </w:rPr>
+              <w:t>Friction coefficients</w:t>
+            </w:r>
+          </w:p>
+        </w:tc>
+        <w:tc>
+          <w:tcPr>
+            <w:tcW w:type="dxa" w:w="3636"/>
+          </w:tcPr>
+          <w:p>
+            <w:r>
+              <w:rPr>
+                <w:rFonts w:ascii="Arial" w:hAnsi="Arial"/>
+                <w:sz w:val="14"/>
+              </w:rPr>
+              <w:t>mu_sn, mu_np, mu_pp from presets or custom values</w:t>
+            </w:r>
+          </w:p>
+        </w:tc>
+        <w:tc>
+          <w:tcPr>
+            <w:tcW w:type="dxa" w:w="3636"/>
+          </w:tcPr>
+          <w:p>
+            <w:r>
+              <w:rPr>
+                <w:rFonts w:ascii="Arial" w:hAnsi="Arial"/>
+                <w:sz w:val="14"/>
+              </w:rPr>
+              <w:t>CTP 0007!A19, D19, G19; preset selectors A20, D20, G20; custom AD2:AF2; Donn?es Vis!Z34:AA49</w:t>
+            </w:r>
+          </w:p>
+        </w:tc>
+        <w:tc>
+          <w:tcPr>
+            <w:tcW w:type="dxa" w:w="3636"/>
+          </w:tcPr>
+          <w:p>
+            <w:r>
+              <w:rPr>
+                <w:rFonts w:ascii="Arial" w:hAnsi="Arial"/>
+                <w:sz w:val="14"/>
+              </w:rPr>
+              <w:t>Directly corresponds to the three friction fields in the app.</w:t>
+            </w:r>
+          </w:p>
+        </w:tc>
+      </w:tr>
+      <w:tr>
+        <w:tc>
+          <w:tcPr>
+            <w:tcW w:type="dxa" w:w="3636"/>
+          </w:tcPr>
+          <w:p>
+            <w:r>
+              <w:rPr>
+                <w:rFonts w:ascii="Arial" w:hAnsi="Arial"/>
+                <w:sz w:val="14"/>
+              </w:rPr>
+              <w:t>Standard tightening torque</w:t>
+            </w:r>
+          </w:p>
+        </w:tc>
+        <w:tc>
+          <w:tcPr>
+            <w:tcW w:type="dxa" w:w="3636"/>
+          </w:tcPr>
+          <w:p>
+            <w:r>
+              <w:rPr>
+                <w:rFonts w:ascii="Arial" w:hAnsi="Arial"/>
+                <w:sz w:val="14"/>
+              </w:rPr>
+              <w:t>Use selected screw type, size, and material standard torque when enabled</w:t>
+            </w:r>
+          </w:p>
+        </w:tc>
+        <w:tc>
+          <w:tcPr>
+            <w:tcW w:type="dxa" w:w="3636"/>
+          </w:tcPr>
+          <w:p>
+            <w:r>
+              <w:rPr>
+                <w:rFonts w:ascii="Arial" w:hAnsi="Arial"/>
+                <w:sz w:val="14"/>
+              </w:rPr>
+              <w:t>CTP 0007!U37; Donn?es Vis!O3:X160; CTM 33 30 10!B15, B18</w:t>
+            </w:r>
+          </w:p>
+        </w:tc>
+        <w:tc>
+          <w:tcPr>
+            <w:tcW w:type="dxa" w:w="3636"/>
+          </w:tcPr>
+          <w:p>
+            <w:r>
+              <w:rPr>
+                <w:rFonts w:ascii="Arial" w:hAnsi="Arial"/>
+                <w:sz w:val="14"/>
+              </w:rPr>
+              <w:t>CTM 33 30 10 is the reference standard torque sheet; the app uses the Donn?es Vis torque lookup for the selected CTP screw row.</w:t>
+            </w:r>
+          </w:p>
+        </w:tc>
+      </w:tr>
+      <w:tr>
+        <w:tc>
+          <w:tcPr>
+            <w:tcW w:type="dxa" w:w="3636"/>
+          </w:tcPr>
+          <w:p>
+            <w:r>
+              <w:rPr>
+                <w:rFonts w:ascii="Arial" w:hAnsi="Arial"/>
+                <w:sz w:val="14"/>
+              </w:rPr>
+              <w:t>Thread geometry</w:t>
+            </w:r>
+          </w:p>
+        </w:tc>
+        <w:tc>
+          <w:tcPr>
+            <w:tcW w:type="dxa" w:w="3636"/>
+          </w:tcPr>
+          <w:p>
+            <w:r>
+              <w:rPr>
+                <w:rFonts w:ascii="Arial" w:hAnsi="Arial"/>
+                <w:sz w:val="14"/>
+              </w:rPr>
+              <w:t>dp = d - 0.6495p; dr = d - 1.2268p; dt = (dp + dr) / 2; As = pi((dp + dr)/4)^2</w:t>
+            </w:r>
+          </w:p>
+        </w:tc>
+        <w:tc>
+          <w:tcPr>
+            <w:tcW w:type="dxa" w:w="3636"/>
+          </w:tcPr>
+          <w:p>
+            <w:r>
+              <w:rPr>
+                <w:rFonts w:ascii="Arial" w:hAnsi="Arial"/>
+                <w:sz w:val="14"/>
+              </w:rPr>
+              <w:t>CTP 0007!U22, U23, U24, U25, U26, U27; areas AB24, AB25</w:t>
+            </w:r>
+          </w:p>
+        </w:tc>
+        <w:tc>
+          <w:tcPr>
+            <w:tcW w:type="dxa" w:w="3636"/>
+          </w:tcPr>
+          <w:p>
+            <w:r>
+              <w:rPr>
+                <w:rFonts w:ascii="Arial" w:hAnsi="Arial"/>
+                <w:sz w:val="14"/>
+              </w:rPr>
+              <w:t>These are the main screw-data geometry rows.</w:t>
+            </w:r>
+          </w:p>
+        </w:tc>
+      </w:tr>
+      <w:tr>
+        <w:tc>
+          <w:tcPr>
+            <w:tcW w:type="dxa" w:w="3636"/>
+          </w:tcPr>
+          <w:p>
+            <w:r>
+              <w:rPr>
+                <w:rFonts w:ascii="Arial" w:hAnsi="Arial"/>
+                <w:sz w:val="14"/>
+              </w:rPr>
+              <w:t>Shear/bending diameter</w:t>
+            </w:r>
+          </w:p>
+        </w:tc>
+        <w:tc>
+          <w:tcPr>
+            <w:tcW w:type="dxa" w:w="3636"/>
+          </w:tcPr>
+          <w:p>
+            <w:r>
+              <w:rPr>
+                <w:rFonts w:ascii="Arial" w:hAnsi="Arial"/>
+                <w:sz w:val="14"/>
+              </w:rPr>
+              <w:t>dsb = dt for Thread shear plane, or shank diameter for Shank shear plane</w:t>
+            </w:r>
+          </w:p>
+        </w:tc>
+        <w:tc>
+          <w:tcPr>
+            <w:tcW w:type="dxa" w:w="3636"/>
+          </w:tcPr>
+          <w:p>
+            <w:r>
+              <w:rPr>
+                <w:rFonts w:ascii="Arial" w:hAnsi="Arial"/>
+                <w:sz w:val="14"/>
+              </w:rPr>
+              <w:t>CTP 0007!O28, U28, AB28; shank lookup through Donn?es Vis!B3:I168</w:t>
+            </w:r>
+          </w:p>
+        </w:tc>
+        <w:tc>
+          <w:tcPr>
+            <w:tcW w:type="dxa" w:w="3636"/>
+          </w:tcPr>
+          <w:p>
+            <w:r>
+              <w:rPr>
+                <w:rFonts w:ascii="Arial" w:hAnsi="Arial"/>
+                <w:sz w:val="14"/>
+              </w:rPr>
+              <w:t>The app uses the same Thread/Shank selection concept.</w:t>
+            </w:r>
+          </w:p>
+        </w:tc>
+      </w:tr>
+      <w:tr>
+        <w:tc>
+          <w:tcPr>
+            <w:tcW w:type="dxa" w:w="3636"/>
+          </w:tcPr>
+          <w:p>
+            <w:r>
+              <w:rPr>
+                <w:rFonts w:ascii="Arial" w:hAnsi="Arial"/>
+                <w:sz w:val="14"/>
+              </w:rPr>
+              <w:t>Groove diameter</w:t>
+            </w:r>
+          </w:p>
+        </w:tc>
+        <w:tc>
+          <w:tcPr>
+            <w:tcW w:type="dxa" w:w="3636"/>
+          </w:tcPr>
+          <w:p>
+            <w:r>
+              <w:rPr>
+                <w:rFonts w:ascii="Arial" w:hAnsi="Arial"/>
+                <w:sz w:val="14"/>
+              </w:rPr>
+              <w:t>No groove when groove diameter is blank/N/A/zero; otherwise use specified diameter</w:t>
+            </w:r>
+          </w:p>
+        </w:tc>
+        <w:tc>
+          <w:tcPr>
+            <w:tcW w:type="dxa" w:w="3636"/>
+          </w:tcPr>
+          <w:p>
+            <w:r>
+              <w:rPr>
+                <w:rFonts w:ascii="Arial" w:hAnsi="Arial"/>
+                <w:sz w:val="14"/>
+              </w:rPr>
+              <w:t>CTP 0007!O7, U30, AB30</w:t>
+            </w:r>
+          </w:p>
+        </w:tc>
+        <w:tc>
+          <w:tcPr>
+            <w:tcW w:type="dxa" w:w="3636"/>
+          </w:tcPr>
+          <w:p>
+            <w:r>
+              <w:rPr>
+                <w:rFonts w:ascii="Arial" w:hAnsi="Arial"/>
+                <w:sz w:val="14"/>
+              </w:rPr>
+              <w:t>In the spreadsheet U30 equal to zero drives No groove behavior in rows U67:U70.</w:t>
+            </w:r>
+          </w:p>
+        </w:tc>
+      </w:tr>
+      <w:tr>
+        <w:tc>
+          <w:tcPr>
+            <w:tcW w:type="dxa" w:w="3636"/>
+          </w:tcPr>
+          <w:p>
+            <w:r>
+              <w:rPr>
+                <w:rFonts w:ascii="Arial" w:hAnsi="Arial"/>
+                <w:sz w:val="14"/>
+              </w:rPr>
+              <w:t>Nut contact diameter and average nut radius</w:t>
+            </w:r>
+          </w:p>
+        </w:tc>
+        <w:tc>
+          <w:tcPr>
+            <w:tcW w:type="dxa" w:w="3636"/>
+          </w:tcPr>
+          <w:p>
+            <w:r>
+              <w:rPr>
+                <w:rFonts w:ascii="Arial" w:hAnsi="Arial"/>
+                <w:sz w:val="14"/>
+              </w:rPr>
+              <w:t>dc from standard contact or special contact; Rn = (2/3)((Ro^3 - Ri^3)/(Ro^2 - Ri^2))</w:t>
+            </w:r>
+          </w:p>
+        </w:tc>
+        <w:tc>
+          <w:tcPr>
+            <w:tcW w:type="dxa" w:w="3636"/>
+          </w:tcPr>
+          <w:p>
+            <w:r>
+              <w:rPr>
+                <w:rFonts w:ascii="Arial" w:hAnsi="Arial"/>
+                <w:sz w:val="14"/>
+              </w:rPr>
+              <w:t>CTP 0007!J31, P31, U31, U32, AB32</w:t>
+            </w:r>
+          </w:p>
+        </w:tc>
+        <w:tc>
+          <w:tcPr>
+            <w:tcW w:type="dxa" w:w="3636"/>
+          </w:tcPr>
+          <w:p>
+            <w:r>
+              <w:rPr>
+                <w:rFonts w:ascii="Arial" w:hAnsi="Arial"/>
+                <w:sz w:val="14"/>
+              </w:rPr>
+              <w:t>J31=Standard and P31=special input control U31. The app exposes Nut contact and Special contact dia beside Standard contact dia.</w:t>
+            </w:r>
+          </w:p>
+        </w:tc>
+      </w:tr>
+      <w:tr>
+        <w:tc>
+          <w:tcPr>
+            <w:tcW w:type="dxa" w:w="3636"/>
+          </w:tcPr>
+          <w:p>
+            <w:r>
+              <w:rPr>
+                <w:rFonts w:ascii="Arial" w:hAnsi="Arial"/>
+                <w:sz w:val="14"/>
+              </w:rPr>
+              <w:t>Sleeve geometry and sleeve yield</w:t>
+            </w:r>
+          </w:p>
+        </w:tc>
+        <w:tc>
+          <w:tcPr>
+            <w:tcW w:type="dxa" w:w="3636"/>
+          </w:tcPr>
+          <w:p>
+            <w:r>
+              <w:rPr>
+                <w:rFonts w:ascii="Arial" w:hAnsi="Arial"/>
+                <w:sz w:val="14"/>
+              </w:rPr>
+              <w:t>Sleeve check active only when sleeve OD exceeds bolt major diameter</w:t>
+            </w:r>
+          </w:p>
+        </w:tc>
+        <w:tc>
+          <w:tcPr>
+            <w:tcW w:type="dxa" w:w="3636"/>
+          </w:tcPr>
+          <w:p>
+            <w:r>
+              <w:rPr>
+                <w:rFonts w:ascii="Arial" w:hAnsi="Arial"/>
+                <w:sz w:val="14"/>
+              </w:rPr>
+              <w:t>CTP 0007!U33, O33, AB33, U34, AB34</w:t>
+            </w:r>
+          </w:p>
+        </w:tc>
+        <w:tc>
+          <w:tcPr>
+            <w:tcW w:type="dxa" w:w="3636"/>
+          </w:tcPr>
+          <w:p>
+            <w:r>
+              <w:rPr>
+                <w:rFonts w:ascii="Arial" w:hAnsi="Arial"/>
+                <w:sz w:val="14"/>
+              </w:rPr>
+              <w:t>The app adds sleeve material presets; the spreadsheet has the sleeve yield input at U34.</w:t>
+            </w:r>
+          </w:p>
+        </w:tc>
+      </w:tr>
+      <w:tr>
+        <w:tc>
+          <w:tcPr>
+            <w:tcW w:type="dxa" w:w="3636"/>
+          </w:tcPr>
+          <w:p>
+            <w:r>
+              <w:rPr>
+                <w:rFonts w:ascii="Arial" w:hAnsi="Arial"/>
+                <w:sz w:val="14"/>
+              </w:rPr>
+              <w:t>Effective lever arm</w:t>
+            </w:r>
+          </w:p>
+        </w:tc>
+        <w:tc>
+          <w:tcPr>
+            <w:tcW w:type="dxa" w:w="3636"/>
+          </w:tcPr>
+          <w:p>
+            <w:r>
+              <w:rPr>
+                <w:rFonts w:ascii="Arial" w:hAnsi="Arial"/>
+                <w:sz w:val="14"/>
+              </w:rPr>
+              <w:t>Leff = 0.05 for Stripper bolt; Leff = 0.15 pack thickness for Drive bolt or Shim</w:t>
+            </w:r>
+          </w:p>
+        </w:tc>
+        <w:tc>
+          <w:tcPr>
+            <w:tcW w:type="dxa" w:w="3636"/>
+          </w:tcPr>
+          <w:p>
+            <w:r>
+              <w:rPr>
+                <w:rFonts w:ascii="Arial" w:hAnsi="Arial"/>
+                <w:sz w:val="14"/>
+              </w:rPr>
+              <w:t>CTP 0007!U29</w:t>
+            </w:r>
+          </w:p>
+        </w:tc>
+        <w:tc>
+          <w:tcPr>
+            <w:tcW w:type="dxa" w:w="3636"/>
+          </w:tcPr>
+          <w:p>
+            <w:r>
+              <w:rPr>
+                <w:rFonts w:ascii="Arial" w:hAnsi="Arial"/>
+                <w:sz w:val="14"/>
+              </w:rPr>
+              <w:t>The spreadsheet has a direct Leff input. The app derives Leff from joint type and pack thickness per the requested workflow.</w:t>
+            </w:r>
+          </w:p>
+        </w:tc>
+      </w:tr>
+      <w:tr>
+        <w:tc>
+          <w:tcPr>
+            <w:tcW w:type="dxa" w:w="3636"/>
+          </w:tcPr>
+          <w:p>
+            <w:r>
+              <w:rPr>
+                <w:rFonts w:ascii="Arial" w:hAnsi="Arial"/>
+                <w:sz w:val="14"/>
+              </w:rPr>
+              <w:t>Duty torque cases</w:t>
+            </w:r>
+          </w:p>
+        </w:tc>
+        <w:tc>
+          <w:tcPr>
+            <w:tcW w:type="dxa" w:w="3636"/>
+          </w:tcPr>
+          <w:p>
+            <w:r>
+              <w:rPr>
+                <w:rFonts w:ascii="Arial" w:hAnsi="Arial"/>
+                <w:sz w:val="14"/>
+              </w:rPr>
+              <w:t>Continuous, Peak, Momentary duty torque cases</w:t>
+            </w:r>
+          </w:p>
+        </w:tc>
+        <w:tc>
+          <w:tcPr>
+            <w:tcW w:type="dxa" w:w="3636"/>
+          </w:tcPr>
+          <w:p>
+            <w:r>
+              <w:rPr>
+                <w:rFonts w:ascii="Arial" w:hAnsi="Arial"/>
+                <w:sz w:val="14"/>
+              </w:rPr>
+              <w:t>CTP 0007!J19, O19, R19</w:t>
+            </w:r>
+          </w:p>
+        </w:tc>
+        <w:tc>
+          <w:tcPr>
+            <w:tcW w:type="dxa" w:w="3636"/>
+          </w:tcPr>
+          <w:p>
+            <w:r>
+              <w:rPr>
+                <w:rFonts w:ascii="Arial" w:hAnsi="Arial"/>
+                <w:sz w:val="14"/>
+              </w:rPr>
+              <w:t>The template calculates O19 = 2 x J19 and R19 = 1.15 x O19. The app allows all three duty torque cases to be entered directly.</w:t>
+            </w:r>
+          </w:p>
+        </w:tc>
+      </w:tr>
+      <w:tr>
+        <w:tc>
+          <w:tcPr>
+            <w:tcW w:type="dxa" w:w="3636"/>
+          </w:tcPr>
+          <w:p>
+            <w:r>
+              <w:rPr>
+                <w:rFonts w:ascii="Arial" w:hAnsi="Arial"/>
+                <w:sz w:val="14"/>
+              </w:rPr>
+              <w:t>Tightening input and axial pretension</w:t>
+            </w:r>
+          </w:p>
+        </w:tc>
+        <w:tc>
+          <w:tcPr>
+            <w:tcW w:type="dxa" w:w="3636"/>
+          </w:tcPr>
+          <w:p>
+            <w:r>
+              <w:rPr>
+                <w:rFonts w:ascii="Arial" w:hAnsi="Arial"/>
+                <w:sz w:val="14"/>
+              </w:rPr>
+              <w:t>Fv = 1000 Tt / (0.16p + 0.583 mu_sn dp + mu_np Rn), or Fv = %TYS As Sy</w:t>
+            </w:r>
+          </w:p>
+        </w:tc>
+        <w:tc>
+          <w:tcPr>
+            <w:tcW w:type="dxa" w:w="3636"/>
+          </w:tcPr>
+          <w:p>
+            <w:r>
+              <w:rPr>
+                <w:rFonts w:ascii="Arial" w:hAnsi="Arial"/>
+                <w:sz w:val="14"/>
+              </w:rPr>
+              <w:t>CTP 0007!V19, Z19, U36; reported torque U38; preload ratio AD24; message A38</w:t>
+            </w:r>
+          </w:p>
+        </w:tc>
+        <w:tc>
+          <w:tcPr>
+            <w:tcW w:type="dxa" w:w="3636"/>
+          </w:tcPr>
+          <w:p>
+            <w:r>
+              <w:rPr>
+                <w:rFonts w:ascii="Arial" w:hAnsi="Arial"/>
+                <w:sz w:val="14"/>
+              </w:rPr>
+              <w:t>The app rejects simultaneous torque and %TYS input, then reports the implied value of the other basis.</w:t>
+            </w:r>
+          </w:p>
+        </w:tc>
+      </w:tr>
+      <w:tr>
+        <w:tc>
+          <w:tcPr>
+            <w:tcW w:type="dxa" w:w="3636"/>
+          </w:tcPr>
+          <w:p>
+            <w:r>
+              <w:rPr>
+                <w:rFonts w:ascii="Arial" w:hAnsi="Arial"/>
+                <w:sz w:val="14"/>
+              </w:rPr>
+              <w:t>Nut friction and torsional tightening torque</w:t>
+            </w:r>
+          </w:p>
+        </w:tc>
+        <w:tc>
+          <w:tcPr>
+            <w:tcW w:type="dxa" w:w="3636"/>
+          </w:tcPr>
+          <w:p>
+            <w:r>
+              <w:rPr>
+                <w:rFonts w:ascii="Arial" w:hAnsi="Arial"/>
+                <w:sz w:val="14"/>
+              </w:rPr>
+              <w:t>T_np = mu_np Rn Fv / 1000; T_torsion = (0.16p + 0.583 mu_sn dp)Fv / 1000</w:t>
+            </w:r>
+          </w:p>
+        </w:tc>
+        <w:tc>
+          <w:tcPr>
+            <w:tcW w:type="dxa" w:w="3636"/>
+          </w:tcPr>
+          <w:p>
+            <w:r>
+              <w:rPr>
+                <w:rFonts w:ascii="Arial" w:hAnsi="Arial"/>
+                <w:sz w:val="14"/>
+              </w:rPr>
+              <w:t>CTP 0007!U39, U40; labels A39:A40</w:t>
+            </w:r>
+          </w:p>
+        </w:tc>
+        <w:tc>
+          <w:tcPr>
+            <w:tcW w:type="dxa" w:w="3636"/>
+          </w:tcPr>
+          <w:p>
+            <w:r>
+              <w:rPr>
+                <w:rFonts w:ascii="Arial" w:hAnsi="Arial"/>
+                <w:sz w:val="14"/>
+              </w:rPr>
+              <w:t>U39 is the nut/contact friction torque component. U40 is the torsional tightening torque used in groove and thread-root checks.</w:t>
+            </w:r>
+          </w:p>
+        </w:tc>
+      </w:tr>
+      <w:tr>
+        <w:tc>
+          <w:tcPr>
+            <w:tcW w:type="dxa" w:w="3636"/>
+          </w:tcPr>
+          <w:p>
+            <w:r>
+              <w:rPr>
+                <w:rFonts w:ascii="Arial" w:hAnsi="Arial"/>
+                <w:sz w:val="14"/>
+              </w:rPr>
+              <w:t>Flange friction torque and ratio</w:t>
+            </w:r>
+          </w:p>
+        </w:tc>
+        <w:tc>
+          <w:tcPr>
+            <w:tcW w:type="dxa" w:w="3636"/>
+          </w:tcPr>
+          <w:p>
+            <w:r>
+              <w:rPr>
+                <w:rFonts w:ascii="Arial" w:hAnsi="Arial"/>
+                <w:sz w:val="14"/>
+              </w:rPr>
+              <w:t>T_friction = Fv n mu_pp PCD / 2 / 1000; ratio = T_friction / T_duty</w:t>
+            </w:r>
+          </w:p>
+        </w:tc>
+        <w:tc>
+          <w:tcPr>
+            <w:tcW w:type="dxa" w:w="3636"/>
+          </w:tcPr>
+          <w:p>
+            <w:r>
+              <w:rPr>
+                <w:rFonts w:ascii="Arial" w:hAnsi="Arial"/>
+                <w:sz w:val="14"/>
+              </w:rPr>
+              <w:t>CTP 0007!P43, P44, S44, W44</w:t>
+            </w:r>
+          </w:p>
+        </w:tc>
+        <w:tc>
+          <w:tcPr>
+            <w:tcW w:type="dxa" w:w="3636"/>
+          </w:tcPr>
+          <w:p>
+            <w:r>
+              <w:rPr>
+                <w:rFonts w:ascii="Arial" w:hAnsi="Arial"/>
+                <w:sz w:val="14"/>
+              </w:rPr>
+              <w:t>The app displays the ratio as a percentage and does not warn solely because friction torque is below duty torque.</w:t>
+            </w:r>
+          </w:p>
+        </w:tc>
+      </w:tr>
+      <w:tr>
+        <w:tc>
+          <w:tcPr>
+            <w:tcW w:type="dxa" w:w="3636"/>
+          </w:tcPr>
+          <w:p>
+            <w:r>
+              <w:rPr>
+                <w:rFonts w:ascii="Arial" w:hAnsi="Arial"/>
+                <w:sz w:val="14"/>
+              </w:rPr>
+              <w:t>Residual torque and shear load</w:t>
+            </w:r>
+          </w:p>
+        </w:tc>
+        <w:tc>
+          <w:tcPr>
+            <w:tcW w:type="dxa" w:w="3636"/>
+          </w:tcPr>
+          <w:p>
+            <w:r>
+              <w:rPr>
+                <w:rFonts w:ascii="Arial" w:hAnsi="Arial"/>
+                <w:sz w:val="14"/>
+              </w:rPr>
+              <w:t>T_residual = max(0, T_duty - T_friction); V_total = 2000 T_residual / (PCD n)</w:t>
+            </w:r>
+          </w:p>
+        </w:tc>
+        <w:tc>
+          <w:tcPr>
+            <w:tcW w:type="dxa" w:w="3636"/>
+          </w:tcPr>
+          <w:p>
+            <w:r>
+              <w:rPr>
+                <w:rFonts w:ascii="Arial" w:hAnsi="Arial"/>
+                <w:sz w:val="14"/>
+              </w:rPr>
+              <w:t>CTP 0007!P45:S45:W45 and P46:S46:W46</w:t>
+            </w:r>
+          </w:p>
+        </w:tc>
+        <w:tc>
+          <w:tcPr>
+            <w:tcW w:type="dxa" w:w="3636"/>
+          </w:tcPr>
+          <w:p>
+            <w:r>
+              <w:rPr>
+                <w:rFonts w:ascii="Arial" w:hAnsi="Arial"/>
+                <w:sz w:val="14"/>
+              </w:rPr>
+              <w:t>The app carries residual torque into the bolt/sleeve stress calculations.</w:t>
+            </w:r>
+          </w:p>
+        </w:tc>
+      </w:tr>
+      <w:tr>
+        <w:tc>
+          <w:tcPr>
+            <w:tcW w:type="dxa" w:w="3636"/>
+          </w:tcPr>
+          <w:p>
+            <w:r>
+              <w:rPr>
+                <w:rFonts w:ascii="Arial" w:hAnsi="Arial"/>
+                <w:sz w:val="14"/>
+              </w:rPr>
+              <w:t>Sleeve stress and safety factor</w:t>
+            </w:r>
+          </w:p>
+        </w:tc>
+        <w:tc>
+          <w:tcPr>
+            <w:tcW w:type="dxa" w:w="3636"/>
+          </w:tcPr>
+          <w:p>
+            <w:r>
+              <w:rPr>
+                <w:rFonts w:ascii="Arial" w:hAnsi="Arial"/>
+                <w:sz w:val="14"/>
+              </w:rPr>
+              <w:t>Sleeve shear split, bending stress, shear stress, VM stress, and sleeve SF</w:t>
+            </w:r>
+          </w:p>
+        </w:tc>
+        <w:tc>
+          <w:tcPr>
+            <w:tcW w:type="dxa" w:w="3636"/>
+          </w:tcPr>
+          <w:p>
+            <w:r>
+              <w:rPr>
+                <w:rFonts w:ascii="Arial" w:hAnsi="Arial"/>
+                <w:sz w:val="14"/>
+              </w:rPr>
+              <w:t>CTP 0007!P49:S49:W49, P50:S50:W50, P51:S51:W51, P52:S52:W52, P53:S53:W53; Sleeve Bending!B28, B30, B32</w:t>
+            </w:r>
+          </w:p>
+        </w:tc>
+        <w:tc>
+          <w:tcPr>
+            <w:tcW w:type="dxa" w:w="3636"/>
+          </w:tcPr>
+          <w:p>
+            <w:r>
+              <w:rPr>
+                <w:rFonts w:ascii="Arial" w:hAnsi="Arial"/>
+                <w:sz w:val="14"/>
+              </w:rPr>
+              <w:t>The GUI table follows the CTP 0007 row 48:53 direct sleeve stress block; Sleeve Bending supports the template allowable peak calculation.</w:t>
+            </w:r>
+          </w:p>
+        </w:tc>
+      </w:tr>
+      <w:tr>
+        <w:tc>
+          <w:tcPr>
+            <w:tcW w:type="dxa" w:w="3636"/>
+          </w:tcPr>
+          <w:p>
+            <w:r>
+              <w:rPr>
+                <w:rFonts w:ascii="Arial" w:hAnsi="Arial"/>
+                <w:sz w:val="14"/>
+              </w:rPr>
+              <w:t>Bolt shear/bending stress and safety factor</w:t>
+            </w:r>
+          </w:p>
+        </w:tc>
+        <w:tc>
+          <w:tcPr>
+            <w:tcW w:type="dxa" w:w="3636"/>
+          </w:tcPr>
+          <w:p>
+            <w:r>
+              <w:rPr>
+                <w:rFonts w:ascii="Arial" w:hAnsi="Arial"/>
+                <w:sz w:val="14"/>
+              </w:rPr>
+              <w:t>Bolt share, axial stress, bending stress, shear stress, VM stress, and bolt SF</w:t>
+            </w:r>
+          </w:p>
+        </w:tc>
+        <w:tc>
+          <w:tcPr>
+            <w:tcW w:type="dxa" w:w="3636"/>
+          </w:tcPr>
+          <w:p>
+            <w:r>
+              <w:rPr>
+                <w:rFonts w:ascii="Arial" w:hAnsi="Arial"/>
+                <w:sz w:val="14"/>
+              </w:rPr>
+              <w:t>CTP 0007!P56:S56:W56, P57:S57:W57, P61:S61:W61, P62:S62:W62, P63:S63:W63, P64:S64:W64; Bolt Bending!B32, B34, B36 and J49:J59</w:t>
+            </w:r>
+          </w:p>
+        </w:tc>
+        <w:tc>
+          <w:tcPr>
+            <w:tcW w:type="dxa" w:w="3636"/>
+          </w:tcPr>
+          <w:p>
+            <w:r>
+              <w:rPr>
+                <w:rFonts w:ascii="Arial" w:hAnsi="Arial"/>
+                <w:sz w:val="14"/>
+              </w:rPr>
+              <w:t>The app column Maxi Stress (VM) MPa corresponds to CTP 0007!P63/S63/W63 for the three duty cases.</w:t>
+            </w:r>
+          </w:p>
+        </w:tc>
+      </w:tr>
+      <w:tr>
+        <w:tc>
+          <w:tcPr>
+            <w:tcW w:type="dxa" w:w="3636"/>
+          </w:tcPr>
+          <w:p>
+            <w:r>
+              <w:rPr>
+                <w:rFonts w:ascii="Arial" w:hAnsi="Arial"/>
+                <w:sz w:val="14"/>
+              </w:rPr>
+              <w:t>Partial sleeve/shank block</w:t>
+            </w:r>
+          </w:p>
+        </w:tc>
+        <w:tc>
+          <w:tcPr>
+            <w:tcW w:type="dxa" w:w="3636"/>
+          </w:tcPr>
+          <w:p>
+            <w:r>
+              <w:rPr>
+                <w:rFonts w:ascii="Arial" w:hAnsi="Arial"/>
+                <w:sz w:val="14"/>
+              </w:rPr>
+              <w:t>Additional partial-sleeve shank shear block in the spreadsheet</w:t>
+            </w:r>
+          </w:p>
+        </w:tc>
+        <w:tc>
+          <w:tcPr>
+            <w:tcW w:type="dxa" w:w="3636"/>
+          </w:tcPr>
+          <w:p>
+            <w:r>
+              <w:rPr>
+                <w:rFonts w:ascii="Arial" w:hAnsi="Arial"/>
+                <w:sz w:val="14"/>
+              </w:rPr>
+              <w:t>CTP 0007!P58:S58:W58, P59:S59:W59, P60:S60:W60</w:t>
+            </w:r>
+          </w:p>
+        </w:tc>
+        <w:tc>
+          <w:tcPr>
+            <w:tcW w:type="dxa" w:w="3636"/>
+          </w:tcPr>
+          <w:p>
+            <w:r>
+              <w:rPr>
+                <w:rFonts w:ascii="Arial" w:hAnsi="Arial"/>
+                <w:sz w:val="14"/>
+              </w:rPr>
+              <w:t>The app reports the main bolt shear/bending SF from P64/S64/W64 equivalent calculations.</w:t>
+            </w:r>
+          </w:p>
+        </w:tc>
+      </w:tr>
+      <w:tr>
+        <w:tc>
+          <w:tcPr>
+            <w:tcW w:type="dxa" w:w="3636"/>
+          </w:tcPr>
+          <w:p>
+            <w:r>
+              <w:rPr>
+                <w:rFonts w:ascii="Arial" w:hAnsi="Arial"/>
+                <w:sz w:val="14"/>
+              </w:rPr>
+              <w:t>Groove assembly stress</w:t>
+            </w:r>
+          </w:p>
+        </w:tc>
+        <w:tc>
+          <w:tcPr>
+            <w:tcW w:type="dxa" w:w="3636"/>
+          </w:tcPr>
+          <w:p>
+            <w:r>
+              <w:rPr>
+                <w:rFonts w:ascii="Arial" w:hAnsi="Arial"/>
+                <w:sz w:val="14"/>
+              </w:rPr>
+              <w:t>sigma_groove, tau_groove, VM_groove, SF_groove</w:t>
+            </w:r>
+          </w:p>
+        </w:tc>
+        <w:tc>
+          <w:tcPr>
+            <w:tcW w:type="dxa" w:w="3636"/>
+          </w:tcPr>
+          <w:p>
+            <w:r>
+              <w:rPr>
+                <w:rFonts w:ascii="Arial" w:hAnsi="Arial"/>
+                <w:sz w:val="14"/>
+              </w:rPr>
+              <w:t>CTP 0007!U67, U68, U69, U70</w:t>
+            </w:r>
+          </w:p>
+        </w:tc>
+        <w:tc>
+          <w:tcPr>
+            <w:tcW w:type="dxa" w:w="3636"/>
+          </w:tcPr>
+          <w:p>
+            <w:r>
+              <w:rPr>
+                <w:rFonts w:ascii="Arial" w:hAnsi="Arial"/>
+                <w:sz w:val="14"/>
+              </w:rPr>
+              <w:t>Blank/N/A groove in the app maps to the spreadsheet No groove branch.</w:t>
+            </w:r>
+          </w:p>
+        </w:tc>
+      </w:tr>
+      <w:tr>
+        <w:tc>
+          <w:tcPr>
+            <w:tcW w:type="dxa" w:w="3636"/>
+          </w:tcPr>
+          <w:p>
+            <w:r>
+              <w:rPr>
+                <w:rFonts w:ascii="Arial" w:hAnsi="Arial"/>
+                <w:sz w:val="14"/>
+              </w:rPr>
+              <w:t>Thread-root assembly stress</w:t>
+            </w:r>
+          </w:p>
+        </w:tc>
+        <w:tc>
+          <w:tcPr>
+            <w:tcW w:type="dxa" w:w="3636"/>
+          </w:tcPr>
+          <w:p>
+            <w:r>
+              <w:rPr>
+                <w:rFonts w:ascii="Arial" w:hAnsi="Arial"/>
+                <w:sz w:val="14"/>
+              </w:rPr>
+              <w:t>sigma_thread, tau_thread, VM_thread, SF_thread_root</w:t>
+            </w:r>
+          </w:p>
+        </w:tc>
+        <w:tc>
+          <w:tcPr>
+            <w:tcW w:type="dxa" w:w="3636"/>
+          </w:tcPr>
+          <w:p>
+            <w:r>
+              <w:rPr>
+                <w:rFonts w:ascii="Arial" w:hAnsi="Arial"/>
+                <w:sz w:val="14"/>
+              </w:rPr>
+              <w:t>CTP 0007!U73, U74, U75, U76</w:t>
+            </w:r>
+          </w:p>
+        </w:tc>
+        <w:tc>
+          <w:tcPr>
+            <w:tcW w:type="dxa" w:w="3636"/>
+          </w:tcPr>
+          <w:p>
+            <w:r>
+              <w:rPr>
+                <w:rFonts w:ascii="Arial" w:hAnsi="Arial"/>
+                <w:sz w:val="14"/>
+              </w:rPr>
+              <w:t>The app reports the thread-root safety factor and warning state from this same calculation group.</w:t>
+            </w:r>
+          </w:p>
+        </w:tc>
+      </w:tr>
+      <w:tr>
+        <w:tc>
+          <w:tcPr>
+            <w:tcW w:type="dxa" w:w="3636"/>
+          </w:tcPr>
+          <w:p>
+            <w:r>
+              <w:rPr>
+                <w:rFonts w:ascii="Arial" w:hAnsi="Arial"/>
+                <w:sz w:val="14"/>
+              </w:rPr>
+              <w:t>Thread engagement and pull-out stress</w:t>
+            </w:r>
+          </w:p>
+        </w:tc>
+        <w:tc>
+          <w:tcPr>
+            <w:tcW w:type="dxa" w:w="3636"/>
+          </w:tcPr>
+          <w:p>
+            <w:r>
+              <w:rPr>
+                <w:rFonts w:ascii="Arial" w:hAnsi="Arial"/>
+                <w:sz w:val="14"/>
+              </w:rPr>
+              <w:t>L = 1.2d by default or user-entered manual engagement; A_pullout = pi/2 dp L; first-thread factor; pull-out stress</w:t>
+            </w:r>
+          </w:p>
+        </w:tc>
+        <w:tc>
+          <w:tcPr>
+            <w:tcW w:type="dxa" w:w="3636"/>
+          </w:tcPr>
+          <w:p>
+            <w:r>
+              <w:rPr>
+                <w:rFonts w:ascii="Arial" w:hAnsi="Arial"/>
+                <w:sz w:val="14"/>
+              </w:rPr>
+              <w:t>CTP 0007!U79, U80, U81, U82</w:t>
+            </w:r>
+          </w:p>
+        </w:tc>
+        <w:tc>
+          <w:tcPr>
+            <w:tcW w:type="dxa" w:w="3636"/>
+          </w:tcPr>
+          <w:p>
+            <w:r>
+              <w:rPr>
+                <w:rFonts w:ascii="Arial" w:hAnsi="Arial"/>
+                <w:sz w:val="14"/>
+              </w:rPr>
+              <w:t>The spreadsheet default is U79 = 1.2 x U22. The app also allows manual thread engagement and optional tapped-hole yield comparison.</w:t>
+            </w:r>
+          </w:p>
+        </w:tc>
+      </w:tr>
+      <w:tr>
+        <w:tc>
+          <w:tcPr>
+            <w:tcW w:type="dxa" w:w="3636"/>
+          </w:tcPr>
+          <w:p>
+            <w:r>
+              <w:rPr>
+                <w:rFonts w:ascii="Arial" w:hAnsi="Arial"/>
+                <w:sz w:val="14"/>
+              </w:rPr>
+              <w:t>Minimum safety factor and check text</w:t>
+            </w:r>
+          </w:p>
+        </w:tc>
+        <w:tc>
+          <w:tcPr>
+            <w:tcW w:type="dxa" w:w="3636"/>
+          </w:tcPr>
+          <w:p>
+            <w:r>
+              <w:rPr>
+                <w:rFonts w:ascii="Arial" w:hAnsi="Arial"/>
+                <w:sz w:val="14"/>
+              </w:rPr>
+              <w:t>Minimum of active numeric safety factors and warning text</w:t>
+            </w:r>
+          </w:p>
+        </w:tc>
+        <w:tc>
+          <w:tcPr>
+            <w:tcW w:type="dxa" w:w="3636"/>
+          </w:tcPr>
+          <w:p>
+            <w:r>
+              <w:rPr>
+                <w:rFonts w:ascii="Arial" w:hAnsi="Arial"/>
+                <w:sz w:val="14"/>
+              </w:rPr>
+              <w:t>CTP 0007!AB19; groups P53:S53:W53, P64:S64:W64, U70, U76</w:t>
+            </w:r>
+          </w:p>
+        </w:tc>
+        <w:tc>
+          <w:tcPr>
+            <w:tcW w:type="dxa" w:w="3636"/>
+          </w:tcPr>
+          <w:p>
+            <w:r>
+              <w:rPr>
+                <w:rFonts w:ascii="Arial" w:hAnsi="Arial"/>
+                <w:sz w:val="14"/>
+              </w:rPr>
+              <w:t>The spreadsheet AB19 formula contains the legacy check string. The app computes individual warnings in code so the selected criteria can be changed.</w:t>
+            </w:r>
+          </w:p>
+        </w:tc>
+      </w:tr>
+      <w:tr>
+        <w:tc>
+          <w:tcPr>
+            <w:tcW w:type="dxa" w:w="3636"/>
+          </w:tcPr>
+          <w:p>
+            <w:r>
+              <w:rPr>
+                <w:rFonts w:ascii="Arial" w:hAnsi="Arial"/>
+                <w:sz w:val="14"/>
+              </w:rPr>
+              <w:t>Legacy spreadsheet check thresholds</w:t>
+            </w:r>
+          </w:p>
+        </w:tc>
+        <w:tc>
+          <w:tcPr>
+            <w:tcW w:type="dxa" w:w="3636"/>
+          </w:tcPr>
+          <w:p>
+            <w:r>
+              <w:rPr>
+                <w:rFonts w:ascii="Arial" w:hAnsi="Arial"/>
+                <w:sz w:val="14"/>
+              </w:rPr>
+              <w:t>Template check formula thresholds</w:t>
+            </w:r>
+          </w:p>
+        </w:tc>
+        <w:tc>
+          <w:tcPr>
+            <w:tcW w:type="dxa" w:w="3636"/>
+          </w:tcPr>
+          <w:p>
+            <w:r>
+              <w:rPr>
+                <w:rFonts w:ascii="Arial" w:hAnsi="Arial"/>
+                <w:sz w:val="14"/>
+              </w:rPr>
+              <w:t>CTP 0007!AB19</w:t>
+            </w:r>
+          </w:p>
+        </w:tc>
+        <w:tc>
+          <w:tcPr>
+            <w:tcW w:type="dxa" w:w="3636"/>
+          </w:tcPr>
+          <w:p>
+            <w:r>
+              <w:rPr>
+                <w:rFonts w:ascii="Arial" w:hAnsi="Arial"/>
+                <w:sz w:val="14"/>
+              </w:rPr>
+              <w:t>The template formula checks sleeve/bolt continuous &lt;1.50, peak &lt;1.25, momentary &lt;1.10, groove &lt;1.10, and thread-root &lt;1.10.</w:t>
+            </w:r>
+          </w:p>
+        </w:tc>
+      </w:tr>
+      <w:tr>
+        <w:tc>
+          <w:tcPr>
+            <w:tcW w:type="dxa" w:w="3636"/>
+          </w:tcPr>
+          <w:p>
+            <w:r>
+              <w:rPr>
+                <w:rFonts w:ascii="Arial" w:hAnsi="Arial"/>
+                <w:sz w:val="14"/>
+              </w:rPr>
+              <w:t>API671 criteria selector</w:t>
+            </w:r>
+          </w:p>
+        </w:tc>
+        <w:tc>
+          <w:tcPr>
+            <w:tcW w:type="dxa" w:w="3636"/>
+          </w:tcPr>
+          <w:p>
+            <w:r>
+              <w:rPr>
+                <w:rFonts w:ascii="Arial" w:hAnsi="Arial"/>
+                <w:sz w:val="14"/>
+              </w:rPr>
+              <w:t>API671 5th: continuous &gt;=1.50, peak &gt;=1.15, momentary &gt;=1.00. API671 4th: continuous &gt;=1.25, peak &gt;=1.15, momentary &gt;=1.00.</w:t>
+            </w:r>
+          </w:p>
+        </w:tc>
+        <w:tc>
+          <w:tcPr>
+            <w:tcW w:type="dxa" w:w="3636"/>
+          </w:tcPr>
+          <w:p>
+            <w:r>
+              <w:rPr>
+                <w:rFonts w:ascii="Arial" w:hAnsi="Arial"/>
+                <w:sz w:val="14"/>
+              </w:rPr>
+              <w:t>No direct original CTP 0007 cell; implemented in app code</w:t>
+            </w:r>
+          </w:p>
+        </w:tc>
+        <w:tc>
+          <w:tcPr>
+            <w:tcW w:type="dxa" w:w="3636"/>
+          </w:tcPr>
+          <w:p>
+            <w:r>
+              <w:rPr>
+                <w:rFonts w:ascii="Arial" w:hAnsi="Arial"/>
+                <w:sz w:val="14"/>
+              </w:rPr>
+              <w:t>This is an app extension requested for the Issue H workflow, using the spreadsheet stress outputs as the checked values.</w:t>
+            </w:r>
+          </w:p>
+        </w:tc>
+      </w:tr>
+      <w:tr>
+        <w:tc>
+          <w:tcPr>
+            <w:tcW w:type="dxa" w:w="3636"/>
+          </w:tcPr>
+          <w:p>
+            <w:r>
+              <w:rPr>
+                <w:rFonts w:ascii="Arial" w:hAnsi="Arial"/>
+                <w:sz w:val="14"/>
+              </w:rPr>
+              <w:t>Tightening preload criteria</w:t>
+            </w:r>
+          </w:p>
+        </w:tc>
+        <w:tc>
+          <w:tcPr>
+            <w:tcW w:type="dxa" w:w="3636"/>
+          </w:tcPr>
+          <w:p>
+            <w:r>
+              <w:rPr>
+                <w:rFonts w:ascii="Arial" w:hAnsi="Arial"/>
+                <w:sz w:val="14"/>
+              </w:rPr>
+              <w:t>Stripper bolt and Shim &lt;=60% TYS; Drive bolt &lt;=75% TYS</w:t>
+            </w:r>
+          </w:p>
+        </w:tc>
+        <w:tc>
+          <w:tcPr>
+            <w:tcW w:type="dxa" w:w="3636"/>
+          </w:tcPr>
+          <w:p>
+            <w:r>
+              <w:rPr>
+                <w:rFonts w:ascii="Arial" w:hAnsi="Arial"/>
+                <w:sz w:val="14"/>
+              </w:rPr>
+              <w:t>CTM 33 30 10!B17 for the 75% reference utilization; no direct original CTP 0007 cell for the 60% app limit</w:t>
+            </w:r>
+          </w:p>
+        </w:tc>
+        <w:tc>
+          <w:tcPr>
+            <w:tcW w:type="dxa" w:w="3636"/>
+          </w:tcPr>
+          <w:p>
+            <w:r>
+              <w:rPr>
+                <w:rFonts w:ascii="Arial" w:hAnsi="Arial"/>
+                <w:sz w:val="14"/>
+              </w:rPr>
+              <w:t>The app applies the requested joint-type-specific maximum preload rule.</w:t>
+            </w:r>
+          </w:p>
+        </w:tc>
+      </w:tr>
+      <w:tr>
+        <w:tc>
+          <w:tcPr>
+            <w:tcW w:type="dxa" w:w="3636"/>
+          </w:tcPr>
+          <w:p>
+            <w:r>
+              <w:rPr>
+                <w:rFonts w:ascii="Arial" w:hAnsi="Arial"/>
+                <w:sz w:val="14"/>
+              </w:rPr>
+              <w:t>Tapped-hole yield check</w:t>
+            </w:r>
+          </w:p>
+        </w:tc>
+        <w:tc>
+          <w:tcPr>
+            <w:tcW w:type="dxa" w:w="3636"/>
+          </w:tcPr>
+          <w:p>
+            <w:r>
+              <w:rPr>
+                <w:rFonts w:ascii="Arial" w:hAnsi="Arial"/>
+                <w:sz w:val="14"/>
+              </w:rPr>
+              <w:t>Tapped-hole yield must be greater than or equal to thread pull-out stress when entered</w:t>
+            </w:r>
+          </w:p>
+        </w:tc>
+        <w:tc>
+          <w:tcPr>
+            <w:tcW w:type="dxa" w:w="3636"/>
+          </w:tcPr>
+          <w:p>
+            <w:r>
+              <w:rPr>
+                <w:rFonts w:ascii="Arial" w:hAnsi="Arial"/>
+                <w:sz w:val="14"/>
+              </w:rPr>
+              <w:t>Thread pull-out stress: CTP 0007!U82; no original tapped-hole yield input cell</w:t>
+            </w:r>
+          </w:p>
+        </w:tc>
+        <w:tc>
+          <w:tcPr>
+            <w:tcW w:type="dxa" w:w="3636"/>
+          </w:tcPr>
+          <w:p>
+            <w:r>
+              <w:rPr>
+                <w:rFonts w:ascii="Arial" w:hAnsi="Arial"/>
+                <w:sz w:val="14"/>
+              </w:rPr>
+              <w:t>The tapped-hole yield field and pass/fail warning are app additions.</w:t>
+            </w:r>
+          </w:p>
+        </w:tc>
+      </w:tr>
+      <w:tr>
+        <w:tc>
+          <w:tcPr>
+            <w:tcW w:type="dxa" w:w="3636"/>
+          </w:tcPr>
+          <w:p>
+            <w:r>
+              <w:rPr>
+                <w:rFonts w:ascii="Arial" w:hAnsi="Arial"/>
+                <w:sz w:val="14"/>
+              </w:rPr>
+              <w:t>Allowable peak reference</w:t>
+            </w:r>
+          </w:p>
+        </w:tc>
+        <w:tc>
+          <w:tcPr>
+            <w:tcW w:type="dxa" w:w="3636"/>
+          </w:tcPr>
+          <w:p>
+            <w:r>
+              <w:rPr>
+                <w:rFonts w:ascii="Arial" w:hAnsi="Arial"/>
+                <w:sz w:val="14"/>
+              </w:rPr>
+              <w:t>Allowable peak torque from bolt and sleeve detailed bending sheets</w:t>
+            </w:r>
+          </w:p>
+        </w:tc>
+        <w:tc>
+          <w:tcPr>
+            <w:tcW w:type="dxa" w:w="3636"/>
+          </w:tcPr>
+          <w:p>
+            <w:r>
+              <w:rPr>
+                <w:rFonts w:ascii="Arial" w:hAnsi="Arial"/>
+                <w:sz w:val="14"/>
+              </w:rPr>
+              <w:t>CTP 0007!AD4, AE4; Bolt Bending!B36; Sleeve Bending!B32</w:t>
+            </w:r>
+          </w:p>
+        </w:tc>
+        <w:tc>
+          <w:tcPr>
+            <w:tcW w:type="dxa" w:w="3636"/>
+          </w:tcPr>
+          <w:p>
+            <w:r>
+              <w:rPr>
+                <w:rFonts w:ascii="Arial" w:hAnsi="Arial"/>
+                <w:sz w:val="14"/>
+              </w:rPr>
+              <w:t>This remains a useful template cross-check. The app focuses on the three duty-case stress/SF results.</w:t>
+            </w:r>
+          </w:p>
+        </w:tc>
+      </w:tr>
+    </w:tbl>
     <w:sectPr>
-      <w:pgSz w:w="12240" w:h="15840"/>
-      <w:pgMar w:top="936" w:right="1008" w:bottom="936" w:left="1008" w:header="720" w:footer="720" w:gutter="0"/>
+      <w:footerReference w:type="default" r:id="rId9"/>
+      <w:pgSz w:w="15840" w:h="12240" w:orient="landscape"/>
+      <w:pgMar w:top="648" w:right="648" w:bottom="648" w:left="648" w:header="720" w:footer="720" w:gutter="0"/>
       <w:cols w:space="720"/>
       <w:docGrid w:linePitch="360"/>
     </w:sectPr>
   </w:body>
 </w:document>
+</file>
+
+<file path=word/footer1.xml><?xml version="1.0" encoding="utf-8"?>
+<w:ftr xmlns:m="http://schemas.openxmlformats.org/officeDocument/2006/math" xmlns:mc="http://schemas.openxmlformats.org/markup-compatibility/2006" xmlns:mo="http://schemas.microsoft.com/office/mac/office/2008/main" xmlns:mv="urn:schemas-microsoft-com:mac:vml" xmlns:o="urn:schemas-microsoft-com:office:office" xmlns:r="http://schemas.openxmlformats.org/officeDocument/2006/relationships" xmlns:v="urn:schemas-microsoft-com:vml" xmlns:w10="urn:schemas-microsoft-com:office:word" xmlns:w14="http://schemas.microsoft.com/office/word/2010/wordml" xmlns:w="http://schemas.openxmlformats.org/wordprocessingml/2006/main" xmlns:wne="http://schemas.microsoft.com/office/word/2006/wordml" xmlns:wp14="http://schemas.microsoft.com/office/word/2010/wordprocessingDrawing" xmlns:wp="http://schemas.openxmlformats.org/drawingml/2006/wordprocessingDrawing" xmlns:wpc="http://schemas.microsoft.com/office/word/2010/wordprocessingCanvas" xmlns:wpg="http://schemas.microsoft.com/office/word/2010/wordprocessingGroup" xmlns:wpi="http://schemas.microsoft.com/office/word/2010/wordprocessingInk" xmlns:wps="http://schemas.microsoft.com/office/word/2010/wordprocessingShape" mc:Ignorable="w14 wp14">
+  <w:p>
+    <w:pPr>
+      <w:pStyle w:val="Footer"/>
+    </w:pPr>
+    <w:r>
+      <w:t>CTP0007 Issue H calculation procedure - spreadsheet cell cross-reference</w:t>
+    </w:r>
+  </w:p>
+</w:ftr>
 </file>
 
 <file path=word/numbering.xml><?xml version="1.0" encoding="utf-8"?>
@@ -2110,7 +3186,7 @@
     <w:rsid w:val="00FC693F"/>
     <w:rPr>
       <w:rFonts w:ascii="Arial" w:hAnsi="Arial"/>
-      <w:sz w:val="19"/>
+      <w:sz w:val="18"/>
     </w:rPr>
   </w:style>
   <w:style w:type="paragraph" w:styleId="Header">
@@ -2172,11 +3248,11 @@
       <w:outlineLvl w:val="0"/>
     </w:pPr>
     <w:rPr>
-      <w:rFonts w:asciiTheme="majorHAnsi" w:eastAsiaTheme="majorEastAsia" w:hAnsiTheme="majorHAnsi" w:cstheme="majorBidi" w:ascii="Arial" w:hAnsi="Arial"/>
+      <w:rFonts w:asciiTheme="majorHAnsi" w:eastAsiaTheme="majorEastAsia" w:hAnsiTheme="majorHAnsi" w:cstheme="majorBidi"/>
       <w:b/>
       <w:bCs/>
       <w:color w:val="365F91" w:themeColor="accent1" w:themeShade="BF"/>
-      <w:sz w:val="36"/>
+      <w:sz w:val="28"/>
       <w:szCs w:val="28"/>
     </w:rPr>
   </w:style>
@@ -2196,7 +3272,7 @@
       <w:outlineLvl w:val="1"/>
     </w:pPr>
     <w:rPr>
-      <w:rFonts w:asciiTheme="majorHAnsi" w:eastAsiaTheme="majorEastAsia" w:hAnsiTheme="majorHAnsi" w:cstheme="majorBidi" w:ascii="Arial" w:hAnsi="Arial"/>
+      <w:rFonts w:asciiTheme="majorHAnsi" w:eastAsiaTheme="majorEastAsia" w:hAnsiTheme="majorHAnsi" w:cstheme="majorBidi"/>
       <w:b/>
       <w:bCs/>
       <w:color w:val="4F81BD" w:themeColor="accent1"/>
@@ -2220,11 +3296,10 @@
       <w:outlineLvl w:val="2"/>
     </w:pPr>
     <w:rPr>
-      <w:rFonts w:asciiTheme="majorHAnsi" w:eastAsiaTheme="majorEastAsia" w:hAnsiTheme="majorHAnsi" w:cstheme="majorBidi" w:ascii="Arial" w:hAnsi="Arial"/>
+      <w:rFonts w:asciiTheme="majorHAnsi" w:eastAsiaTheme="majorEastAsia" w:hAnsiTheme="majorHAnsi" w:cstheme="majorBidi"/>
       <w:b/>
       <w:bCs/>
       <w:color w:val="4F81BD" w:themeColor="accent1"/>
-      <w:sz w:val="22"/>
     </w:rPr>
   </w:style>
   <w:style w:type="paragraph" w:styleId="Heading4">
@@ -13795,14 +14870,6 @@
         <w:shd w:val="clear" w:color="auto" w:fill="FBCAA2" w:themeFill="accent6" w:themeFillTint="7F"/>
       </w:tcPr>
     </w:tblStylePr>
-  </w:style>
-  <w:style w:type="paragraph" w:customStyle="1" w:styleId="FormulaBlock">
-    <w:name w:val="Formula Block"/>
-    <w:rPr>
-      <w:rFonts w:ascii="Courier New" w:hAnsi="Courier New"/>
-      <w:color w:val="1E1E1E"/>
-      <w:sz w:val="17"/>
-    </w:rPr>
   </w:style>
 </w:styles>
 </file>

</xml_diff>

<commit_message>
Add sleeve preload safety factor check
</commit_message>
<xml_diff>
--- a/docs/CTP0007_Issue_H_Calculation_Procedure.docx
+++ b/docs/CTP0007_Issue_H_Calculation_Procedure.docx
@@ -468,6 +468,36 @@
     <w:p>
       <w:r>
         <w:t>SF_sleeve = sleeve_yield / VM_sleeve</w:t>
+      </w:r>
+    </w:p>
+    <w:p>
+      <w:r>
+        <w:t>Sleeve preload/gagging safety factor, matching CTP0007 cell AB34:</w:t>
+      </w:r>
+    </w:p>
+    <w:p>
+      <w:r>
+        <w:t>A_sleeve = max(0, pi / 4 * (OD^2 - d^2))</w:t>
+      </w:r>
+    </w:p>
+    <w:p>
+      <w:r>
+        <w:t>sigma_sleeve_preload = Fv / A_sleeve</w:t>
+      </w:r>
+    </w:p>
+    <w:p>
+      <w:r>
+        <w:t>SF_sleeve_preload = sleeve_yield / sigma_sleeve_preload</w:t>
+      </w:r>
+    </w:p>
+    <w:p>
+      <w:r>
+        <w:t>If no sleeve is fitted, the app reports `No Sleeve`. If sleeve OD is not greater than thread major diameter, the app reports `Gagging` to match the spreadsheet error branch.</w:t>
+      </w:r>
+    </w:p>
+    <w:p>
+      <w:r>
+        <w:t>Sleeve preload SF &gt;= 1.25 minimum and &gt;= 1.50 recommended.</w:t>
       </w:r>
     </w:p>
     <w:p>
@@ -5344,6 +5374,238 @@
                 <w:sz w:val="12"/>
               </w:rPr>
               <w:t>Sleeve yield is CTP 0007!U34.</w:t>
+            </w:r>
+          </w:p>
+        </w:tc>
+      </w:tr>
+      <w:tr>
+        <w:tc>
+          <w:tcPr>
+            <w:tcW w:type="dxa" w:w="3657"/>
+          </w:tcPr>
+          <w:p>
+            <w:r>
+              <w:rPr>
+                <w:rFonts w:ascii="Arial" w:hAnsi="Arial"/>
+                <w:sz w:val="12"/>
+              </w:rPr>
+              <w:t>Sleeve preload annulus area</w:t>
+            </w:r>
+          </w:p>
+        </w:tc>
+        <w:tc>
+          <w:tcPr>
+            <w:tcW w:type="dxa" w:w="3657"/>
+          </w:tcPr>
+          <w:p>
+            <w:r>
+              <w:rPr>
+                <w:rFonts w:ascii="Arial" w:hAnsi="Arial"/>
+                <w:sz w:val="12"/>
+              </w:rPr>
+              <w:t>A_sleeve = max(0, pi / 4 * (OD^2 - d^2))</w:t>
+            </w:r>
+          </w:p>
+        </w:tc>
+        <w:tc>
+          <w:tcPr>
+            <w:tcW w:type="dxa" w:w="3657"/>
+          </w:tcPr>
+          <w:p>
+            <w:r>
+              <w:rPr>
+                <w:rFonts w:ascii="Arial" w:hAnsi="Arial"/>
+                <w:sz w:val="12"/>
+              </w:rPr>
+              <w:t>CTP 0007!AB33</w:t>
+            </w:r>
+          </w:p>
+        </w:tc>
+        <w:tc>
+          <w:tcPr>
+            <w:tcW w:type="dxa" w:w="3657"/>
+          </w:tcPr>
+          <w:p>
+            <w:r>
+              <w:rPr>
+                <w:rFonts w:ascii="Arial" w:hAnsi="Arial"/>
+                <w:sz w:val="12"/>
+              </w:rPr>
+              <w:t>Spreadsheet formula: MAX(0, PI()/4*(U33^2-U22^2)).</w:t>
+            </w:r>
+          </w:p>
+        </w:tc>
+      </w:tr>
+      <w:tr>
+        <w:tc>
+          <w:tcPr>
+            <w:tcW w:type="dxa" w:w="3657"/>
+          </w:tcPr>
+          <w:p>
+            <w:r>
+              <w:rPr>
+                <w:rFonts w:ascii="Arial" w:hAnsi="Arial"/>
+                <w:sz w:val="12"/>
+              </w:rPr>
+              <w:t>Sleeve preload stress</w:t>
+            </w:r>
+          </w:p>
+        </w:tc>
+        <w:tc>
+          <w:tcPr>
+            <w:tcW w:type="dxa" w:w="3657"/>
+          </w:tcPr>
+          <w:p>
+            <w:r>
+              <w:rPr>
+                <w:rFonts w:ascii="Arial" w:hAnsi="Arial"/>
+                <w:sz w:val="12"/>
+              </w:rPr>
+              <w:t>sigma_sleeve_preload = Fv / A_sleeve</w:t>
+            </w:r>
+          </w:p>
+        </w:tc>
+        <w:tc>
+          <w:tcPr>
+            <w:tcW w:type="dxa" w:w="3657"/>
+          </w:tcPr>
+          <w:p>
+            <w:r>
+              <w:rPr>
+                <w:rFonts w:ascii="Arial" w:hAnsi="Arial"/>
+                <w:sz w:val="12"/>
+              </w:rPr>
+              <w:t>Embedded in CTP 0007!AB34 as U36/AB33</w:t>
+            </w:r>
+          </w:p>
+        </w:tc>
+        <w:tc>
+          <w:tcPr>
+            <w:tcW w:type="dxa" w:w="3657"/>
+          </w:tcPr>
+          <w:p>
+            <w:r>
+              <w:rPr>
+                <w:rFonts w:ascii="Arial" w:hAnsi="Arial"/>
+                <w:sz w:val="12"/>
+              </w:rPr>
+              <w:t>Uses axial pretension U36 and sleeve annulus area AB33.</w:t>
+            </w:r>
+          </w:p>
+        </w:tc>
+      </w:tr>
+      <w:tr>
+        <w:tc>
+          <w:tcPr>
+            <w:tcW w:type="dxa" w:w="3657"/>
+          </w:tcPr>
+          <w:p>
+            <w:r>
+              <w:rPr>
+                <w:rFonts w:ascii="Arial" w:hAnsi="Arial"/>
+                <w:sz w:val="12"/>
+              </w:rPr>
+              <w:t>Sleeve preload safety factor</w:t>
+            </w:r>
+          </w:p>
+        </w:tc>
+        <w:tc>
+          <w:tcPr>
+            <w:tcW w:type="dxa" w:w="3657"/>
+          </w:tcPr>
+          <w:p>
+            <w:r>
+              <w:rPr>
+                <w:rFonts w:ascii="Arial" w:hAnsi="Arial"/>
+                <w:sz w:val="12"/>
+              </w:rPr>
+              <w:t>SF_sleeve_preload = sleeve_yield / sigma_sleeve_preload</w:t>
+            </w:r>
+          </w:p>
+        </w:tc>
+        <w:tc>
+          <w:tcPr>
+            <w:tcW w:type="dxa" w:w="3657"/>
+          </w:tcPr>
+          <w:p>
+            <w:r>
+              <w:rPr>
+                <w:rFonts w:ascii="Arial" w:hAnsi="Arial"/>
+                <w:sz w:val="12"/>
+              </w:rPr>
+              <w:t>CTP 0007!AB34</w:t>
+            </w:r>
+          </w:p>
+        </w:tc>
+        <w:tc>
+          <w:tcPr>
+            <w:tcW w:type="dxa" w:w="3657"/>
+          </w:tcPr>
+          <w:p>
+            <w:r>
+              <w:rPr>
+                <w:rFonts w:ascii="Arial" w:hAnsi="Arial"/>
+                <w:sz w:val="12"/>
+              </w:rPr>
+              <w:t>Spreadsheet formula: IFERROR(U34/(U36/AB33), "Gagging"). The app displays No Sleeve when sleeve OD is N/A.</w:t>
+            </w:r>
+          </w:p>
+        </w:tc>
+      </w:tr>
+      <w:tr>
+        <w:tc>
+          <w:tcPr>
+            <w:tcW w:type="dxa" w:w="3657"/>
+          </w:tcPr>
+          <w:p>
+            <w:r>
+              <w:rPr>
+                <w:rFonts w:ascii="Arial" w:hAnsi="Arial"/>
+                <w:sz w:val="12"/>
+              </w:rPr>
+              <w:t>Sleeve preload SF criteria</w:t>
+            </w:r>
+          </w:p>
+        </w:tc>
+        <w:tc>
+          <w:tcPr>
+            <w:tcW w:type="dxa" w:w="3657"/>
+          </w:tcPr>
+          <w:p>
+            <w:r>
+              <w:rPr>
+                <w:rFonts w:ascii="Arial" w:hAnsi="Arial"/>
+                <w:sz w:val="12"/>
+              </w:rPr>
+              <w:t>SF_sleeve_preload &gt;= 1.25 minimum; &gt;= 1.50 recommended</w:t>
+            </w:r>
+          </w:p>
+        </w:tc>
+        <w:tc>
+          <w:tcPr>
+            <w:tcW w:type="dxa" w:w="3657"/>
+          </w:tcPr>
+          <w:p>
+            <w:r>
+              <w:rPr>
+                <w:rFonts w:ascii="Arial" w:hAnsi="Arial"/>
+                <w:sz w:val="12"/>
+              </w:rPr>
+              <w:t>App criterion using CTP 0007!AB34 equivalent result</w:t>
+            </w:r>
+          </w:p>
+        </w:tc>
+        <w:tc>
+          <w:tcPr>
+            <w:tcW w:type="dxa" w:w="3657"/>
+          </w:tcPr>
+          <w:p>
+            <w:r>
+              <w:rPr>
+                <w:rFonts w:ascii="Arial" w:hAnsi="Arial"/>
+                <w:sz w:val="12"/>
+              </w:rPr>
+              <w:t>Added to the app Stresses and Checks table and included in Minimum safety factor when numeric.</w:t>
             </w:r>
           </w:p>
         </w:tc>

</xml_diff>

<commit_message>
Allow manual sleeve type override
</commit_message>
<xml_diff>
--- a/docs/CTP0007_Issue_H_Calculation_Procedure.docx
+++ b/docs/CTP0007_Issue_H_Calculation_Procedure.docx
@@ -438,6 +438,16 @@
     <w:p>
       <w:r>
         <w:t>Full Sleeve and Partial Sleeve both affect sleeve shear share, sleeve stresses, and bolt residual shear share. Partial Sleeve additionally activates the shank total-shear check corresponding to CTP0007 rows P58:W60.</w:t>
+      </w:r>
+    </w:p>
+    <w:p>
+      <w:r>
+        <w:t>The app sleeve type input defaults to Auto, which follows the O33 spreadsheet rule above.</w:t>
+      </w:r>
+    </w:p>
+    <w:p>
+      <w:r>
+        <w:t>When the sleeve type is manually set to No Sleeve, Full Sleeve, or Partial Sleeve, the selected type overrides the O33-derived result. Manual Full Sleeve or Partial Sleeve requires a sleeve OD input.</w:t>
       </w:r>
     </w:p>
     <w:p>
@@ -4727,6 +4737,64 @@
                 <w:sz w:val="12"/>
               </w:rPr>
               <w:t>Spreadsheet formula: IF((U33&gt;0)*(O28&lt;&gt;"Shank"), "Full", IF((U33=""), "No Sleeve", "Partial")). The app labels these as No Sleeve, Full Sleeve, and Partial Sleeve.</w:t>
+            </w:r>
+          </w:p>
+        </w:tc>
+      </w:tr>
+      <w:tr>
+        <w:tc>
+          <w:tcPr>
+            <w:tcW w:type="dxa" w:w="3657"/>
+          </w:tcPr>
+          <w:p>
+            <w:r>
+              <w:rPr>
+                <w:rFonts w:ascii="Arial" w:hAnsi="Arial"/>
+                <w:sz w:val="12"/>
+              </w:rPr>
+              <w:t>Sleeve type app override</w:t>
+            </w:r>
+          </w:p>
+        </w:tc>
+        <w:tc>
+          <w:tcPr>
+            <w:tcW w:type="dxa" w:w="3657"/>
+          </w:tcPr>
+          <w:p>
+            <w:r>
+              <w:rPr>
+                <w:rFonts w:ascii="Arial" w:hAnsi="Arial"/>
+                <w:sz w:val="12"/>
+              </w:rPr>
+              <w:t>Auto follows CTP 0007!O33; manual No Sleeve, Full Sleeve, or Partial Sleeve overrides the derived sleeve type</w:t>
+            </w:r>
+          </w:p>
+        </w:tc>
+        <w:tc>
+          <w:tcPr>
+            <w:tcW w:type="dxa" w:w="3657"/>
+          </w:tcPr>
+          <w:p>
+            <w:r>
+              <w:rPr>
+                <w:rFonts w:ascii="Arial" w:hAnsi="Arial"/>
+                <w:sz w:val="12"/>
+              </w:rPr>
+              <w:t>App extension; default source is CTP 0007!O33</w:t>
+            </w:r>
+          </w:p>
+        </w:tc>
+        <w:tc>
+          <w:tcPr>
+            <w:tcW w:type="dxa" w:w="3657"/>
+          </w:tcPr>
+          <w:p>
+            <w:r>
+              <w:rPr>
+                <w:rFonts w:ascii="Arial" w:hAnsi="Arial"/>
+                <w:sz w:val="12"/>
+              </w:rPr>
+              <w:t>Manual Full Sleeve or Partial Sleeve requires Sleeve OD. Manual No Sleeve disables sleeve share, sleeve preload, and partial shank checks even if an OD value remains entered.</w:t>
             </w:r>
           </w:p>
         </w:tc>

</xml_diff>